<commit_message>
Put the repository link at the top of the report
Section 6 asks for the repo link in the report. It was in the header block
with the member names, where it reads as metadata. It now has its own
heading directly under the title so a grader sees it first.
</commit_message>
<xml_diff>
--- a/report/DATA266_Lab1_Report_Team_8.docx
+++ b/report/DATA266_Lab1_Report_Team_8.docx
@@ -36,13 +36,31 @@
         </w:p>
       </w:sdtContent>
     </w:sdt>
-    <w:bookmarkStart w:id="28" w:name="data266-lab-1-team-8"/>
+    <w:bookmarkStart w:id="30" w:name="data266-lab-1-team-8"/>
     <w:p>
       <w:pPr>
         <w:pStyle w:val="Heading1"/>
       </w:pPr>
       <w:r>
         <w:t xml:space="preserve">DATA266 Lab 1, Team 8</w:t>
+      </w:r>
+    </w:p>
+    <w:bookmarkStart w:id="10" w:name="repository"/>
+    <w:p>
+      <w:pPr>
+        <w:pStyle w:val="Heading2"/>
+      </w:pPr>
+      <w:r>
+        <w:t xml:space="preserve">Repository</w:t>
+      </w:r>
+    </w:p>
+    <w:bookmarkStart w:id="9" w:name="httpsgithub.comaneessahebadata-266-lab-1"/>
+    <w:p>
+      <w:pPr>
+        <w:pStyle w:val="Heading3"/>
+      </w:pPr>
+      <w:r>
+        <w:t xml:space="preserve">https://github.com/aneessaheba/DATA-266-Lab-1</w:t>
       </w:r>
     </w:p>
     <w:p>
@@ -62,25 +80,11 @@
       <w:r>
         <w:t xml:space="preserve">Anees Saheba Guddi (SID4 5330), Yashashree Shinde (SID4 4349)</w:t>
       </w:r>
-      <w:r>
-        <w:t xml:space="preserve"> </w:t>
-      </w:r>
-      <w:r>
-        <w:rPr>
-          <w:b/>
-          <w:bCs/>
-        </w:rPr>
-        <w:t xml:space="preserve">Repository:</w:t>
-      </w:r>
-      <w:r>
-        <w:t xml:space="preserve"> </w:t>
-      </w:r>
-      <w:r>
-        <w:t xml:space="preserve">https://github.com/aneessaheba/DATA-266-Lab-1</w:t>
-      </w:r>
-      <w:r>
-        <w:t xml:space="preserve"> </w:t>
-      </w:r>
+    </w:p>
+    <w:p>
+      <w:pPr>
+        <w:pStyle w:val="BodyText"/>
+      </w:pPr>
       <w:r>
         <w:rPr>
           <w:b/>
@@ -95,7 +99,9 @@
         <w:t xml:space="preserve">6 October 2026</w:t>
       </w:r>
     </w:p>
-    <w:bookmarkStart w:id="9" w:name="team-ownership-statement"/>
+    <w:bookmarkEnd w:id="9"/>
+    <w:bookmarkEnd w:id="10"/>
+    <w:bookmarkStart w:id="11" w:name="team-ownership-statement"/>
     <w:p>
       <w:pPr>
         <w:pStyle w:val="Heading2"/>
@@ -172,8 +178,8 @@
         <w:t xml:space="preserve">were written together from both sets of results.</w:t>
       </w:r>
     </w:p>
-    <w:bookmarkEnd w:id="9"/>
-    <w:bookmarkStart w:id="12" w:name="task-1-character-level-language-model"/>
+    <w:bookmarkEnd w:id="11"/>
+    <w:bookmarkStart w:id="14" w:name="task-1-character-level-language-model"/>
     <w:p>
       <w:pPr>
         <w:pStyle w:val="Heading2"/>
@@ -182,7 +188,7 @@
         <w:t xml:space="preserve">2. Task 1, character level language model</w:t>
       </w:r>
     </w:p>
-    <w:bookmarkStart w:id="10" w:name="comparison-table"/>
+    <w:bookmarkStart w:id="12" w:name="comparison-table"/>
     <w:p>
       <w:pPr>
         <w:pStyle w:val="Heading3"/>
@@ -1453,8 +1459,8 @@
         <w:t xml:space="preserve">verified numerically that no position can attend to a future position.</w:t>
       </w:r>
     </w:p>
-    <w:bookmarkEnd w:id="10"/>
-    <w:bookmarkStart w:id="11" w:name="joint-analysis"/>
+    <w:bookmarkEnd w:id="12"/>
+    <w:bookmarkStart w:id="13" w:name="joint-analysis"/>
     <w:p>
       <w:pPr>
         <w:pStyle w:val="Heading3"/>
@@ -1723,9 +1729,9 @@
         <w:t xml:space="preserve">depth, which this comparison cannot do because both changed at once.</w:t>
       </w:r>
     </w:p>
-    <w:bookmarkEnd w:id="11"/>
-    <w:bookmarkEnd w:id="12"/>
-    <w:bookmarkStart w:id="16" w:name="Xac03e36885b5adb6e65358586361dbdafc2b498"/>
+    <w:bookmarkEnd w:id="13"/>
+    <w:bookmarkEnd w:id="14"/>
+    <w:bookmarkStart w:id="18" w:name="Xac03e36885b5adb6e65358586361dbdafc2b498"/>
     <w:p>
       <w:pPr>
         <w:pStyle w:val="Heading2"/>
@@ -1734,7 +1740,7 @@
         <w:t xml:space="preserve">3. Task 2, Yelp Polarity sentiment classification</w:t>
       </w:r>
     </w:p>
-    <w:bookmarkStart w:id="13" w:name="comparison-table-1"/>
+    <w:bookmarkStart w:id="15" w:name="comparison-table-1"/>
     <w:p>
       <w:pPr>
         <w:pStyle w:val="Heading3"/>
@@ -3382,8 +3388,8 @@
         <w:t xml:space="preserve">for transparency but are not quoted here.</w:t>
       </w:r>
     </w:p>
-    <w:bookmarkEnd w:id="13"/>
-    <w:bookmarkStart w:id="14" w:name="significance-tests"/>
+    <w:bookmarkEnd w:id="15"/>
+    <w:bookmarkStart w:id="16" w:name="significance-tests"/>
     <w:p>
       <w:pPr>
         <w:pStyle w:val="Heading3"/>
@@ -3751,8 +3757,8 @@
         <w:t xml:space="preserve">than its own baseline.</w:t>
       </w:r>
     </w:p>
-    <w:bookmarkEnd w:id="14"/>
-    <w:bookmarkStart w:id="15" w:name="joint-analysis-1"/>
+    <w:bookmarkEnd w:id="16"/>
+    <w:bookmarkStart w:id="17" w:name="joint-analysis-1"/>
     <w:p>
       <w:pPr>
         <w:pStyle w:val="Heading3"/>
@@ -4121,9 +4127,9 @@
         <w:t xml:space="preserve">five of her sampled long review failures sit at exactly her 256 token limit.</w:t>
       </w:r>
     </w:p>
-    <w:bookmarkEnd w:id="15"/>
-    <w:bookmarkEnd w:id="16"/>
-    <w:bookmarkStart w:id="19" w:name="task-3-cyclegan-style-transfer"/>
+    <w:bookmarkEnd w:id="17"/>
+    <w:bookmarkEnd w:id="18"/>
+    <w:bookmarkStart w:id="21" w:name="task-3-cyclegan-style-transfer"/>
     <w:p>
       <w:pPr>
         <w:pStyle w:val="Heading2"/>
@@ -4132,7 +4138,7 @@
         <w:t xml:space="preserve">4. Task 3, CycleGAN style transfer</w:t>
       </w:r>
     </w:p>
-    <w:bookmarkStart w:id="17" w:name="comparison-table-2"/>
+    <w:bookmarkStart w:id="19" w:name="comparison-table-2"/>
     <w:p>
       <w:pPr>
         <w:pStyle w:val="Heading3"/>
@@ -5571,8 +5577,8 @@
         <w:t xml:space="preserve">differently. Only the scorer’s version is comparable across the class.</w:t>
       </w:r>
     </w:p>
-    <w:bookmarkEnd w:id="17"/>
-    <w:bookmarkStart w:id="18" w:name="joint-analysis-2"/>
+    <w:bookmarkEnd w:id="19"/>
+    <w:bookmarkStart w:id="20" w:name="joint-analysis-2"/>
     <w:p>
       <w:pPr>
         <w:pStyle w:val="Heading3"/>
@@ -5933,9 +5939,9 @@
         <w:t xml:space="preserve">them as we believe.</w:t>
       </w:r>
     </w:p>
-    <w:bookmarkEnd w:id="18"/>
-    <w:bookmarkEnd w:id="19"/>
-    <w:bookmarkStart w:id="24" w:name="failure-and-error-analysis"/>
+    <w:bookmarkEnd w:id="20"/>
+    <w:bookmarkEnd w:id="21"/>
+    <w:bookmarkStart w:id="26" w:name="failure-and-error-analysis"/>
     <w:p>
       <w:pPr>
         <w:pStyle w:val="Heading2"/>
@@ -5970,7 +5976,7 @@
         <w:t xml:space="preserve">The cases below are quoted from those files.</w:t>
       </w:r>
     </w:p>
-    <w:bookmarkStart w:id="20" w:name="task-1-anees"/>
+    <w:bookmarkStart w:id="22" w:name="task-1-anees"/>
     <w:p>
       <w:pPr>
         <w:pStyle w:val="Heading3"/>
@@ -6141,8 +6147,8 @@
         <w:t xml:space="preserve">model can reach any letter sequence.</w:t>
       </w:r>
     </w:p>
-    <w:bookmarkEnd w:id="20"/>
-    <w:bookmarkStart w:id="21" w:name="task-1-yashashree"/>
+    <w:bookmarkEnd w:id="22"/>
+    <w:bookmarkStart w:id="23" w:name="task-1-yashashree"/>
     <w:p>
       <w:pPr>
         <w:pStyle w:val="Heading3"/>
@@ -6324,8 +6330,8 @@
         <w:t xml:space="preserve">damage the meaning of a longer story.</w:t>
       </w:r>
     </w:p>
-    <w:bookmarkEnd w:id="21"/>
-    <w:bookmarkStart w:id="22" w:name="task-2-both-members"/>
+    <w:bookmarkEnd w:id="23"/>
+    <w:bookmarkStart w:id="24" w:name="task-2-both-members"/>
     <w:p>
       <w:pPr>
         <w:pStyle w:val="Heading3"/>
@@ -6498,8 +6504,8 @@
         <w:t xml:space="preserve">appears somewhere between 256 and 320 tokens on this dataset.</w:t>
       </w:r>
     </w:p>
-    <w:bookmarkEnd w:id="22"/>
-    <w:bookmarkStart w:id="23" w:name="task-3-both-members"/>
+    <w:bookmarkEnd w:id="24"/>
+    <w:bookmarkStart w:id="25" w:name="task-3-both-members"/>
     <w:p>
       <w:pPr>
         <w:pStyle w:val="Heading3"/>
@@ -6654,9 +6660,9 @@
         <w:t xml:space="preserve">exactly, which is the same identity weight that caused her first case.</w:t>
       </w:r>
     </w:p>
-    <w:bookmarkEnd w:id="23"/>
-    <w:bookmarkEnd w:id="24"/>
-    <w:bookmarkStart w:id="25" w:name="evidence-trail"/>
+    <w:bookmarkEnd w:id="25"/>
+    <w:bookmarkEnd w:id="26"/>
+    <w:bookmarkStart w:id="27" w:name="evidence-trail"/>
     <w:p>
       <w:pPr>
         <w:pStyle w:val="Heading2"/>
@@ -7293,8 +7299,8 @@
         <w:t xml:space="preserve">buffers are needed only to resume training.</w:t>
       </w:r>
     </w:p>
-    <w:bookmarkEnd w:id="25"/>
-    <w:bookmarkStart w:id="26" w:name="known-gaps"/>
+    <w:bookmarkEnd w:id="27"/>
+    <w:bookmarkStart w:id="28" w:name="known-gaps"/>
     <w:p>
       <w:pPr>
         <w:pStyle w:val="Heading2"/>
@@ -7470,8 +7476,8 @@
         <w:t xml:space="preserve">the actual weights.</w:t>
       </w:r>
     </w:p>
-    <w:bookmarkEnd w:id="26"/>
-    <w:bookmarkStart w:id="27" w:name="references"/>
+    <w:bookmarkEnd w:id="28"/>
+    <w:bookmarkStart w:id="29" w:name="references"/>
     <w:p>
       <w:pPr>
         <w:pStyle w:val="Heading2"/>
@@ -7636,8 +7642,8 @@
         <w:t xml:space="preserve">Task 3.</w:t>
       </w:r>
     </w:p>
-    <w:bookmarkEnd w:id="27"/>
-    <w:bookmarkEnd w:id="28"/>
+    <w:bookmarkEnd w:id="29"/>
+    <w:bookmarkEnd w:id="30"/>
     <w:sectPr>
       <w:footnotePr>
         <w:numRestart w:val="eachSect"/>

</xml_diff>

<commit_message>
Reformat the report to IEEE conference style
Two column layout in Times, a centred title block with authors and
affiliation, an abstract and index terms spanning both columns, section
heads numbered in Roman numerals with lettered subsections and numbered sub
subsections, tables spanning both columns with captions above in the IEEE
TABLE I form, and numbered references in square brackets.

The contents section sits immediately before the references as asked. All
content is unchanged, only the structure of the headings and the layout.

17 pages in two columns, down from 30 in one, with 30 captioned tables.
Keeps the stylesheet in the repository so the PDF can be regenerated.
</commit_message>
<xml_diff>
--- a/report/DATA266_Lab1_Report_Team_8.docx
+++ b/report/DATA266_Lab1_Report_Team_8.docx
@@ -10,181 +10,173 @@
         <w:t xml:space="preserve">DATA266 Lab 1 Report, Team 8</w:t>
       </w:r>
     </w:p>
-    <w:sdt>
-      <w:sdtPr>
-        <w:docPartObj>
-          <w:docPartGallery w:val="Table of Contents"/>
-          <w:docPartUnique/>
-        </w:docPartObj>
-      </w:sdtPr>
-      <w:sdtContent>
-        <w:p>
-          <w:pPr>
-            <w:pStyle w:val="TOCHeading"/>
-          </w:pPr>
-          <w:r>
-            <w:t xml:space="preserve">Table of Contents</w:t>
-          </w:r>
-        </w:p>
-        <w:p>
-          <w:r>
-            <w:fldChar w:fldCharType="begin" w:dirty="true"/>
-            <w:instrText xml:space="preserve">TOC \o "1-3" \h \z \u</w:instrText>
-            <w:fldChar w:fldCharType="separate"/>
-            <w:fldChar w:fldCharType="end"/>
-          </w:r>
-        </w:p>
-      </w:sdtContent>
-    </w:sdt>
-    <w:bookmarkStart w:id="11" w:name="data266-lab-1-report"/>
+    <w:bookmarkStart w:id="9" w:name="X7c38ccda4451f2c1f86c442f3378c075c7006b8"/>
     <w:p>
       <w:pPr>
         <w:pStyle w:val="Heading1"/>
       </w:pPr>
       <w:r>
-        <w:t xml:space="preserve">DATA266 Lab 1 Report</w:t>
-      </w:r>
-    </w:p>
-    <w:bookmarkStart w:id="9" w:name="team-8"/>
-    <w:p>
-      <w:pPr>
-        <w:pStyle w:val="Heading2"/>
-      </w:pPr>
-      <w:r>
-        <w:t xml:space="preserve">Team 8</w:t>
-      </w:r>
-    </w:p>
-    <w:tbl>
-      <w:tblPr>
-        <w:tblStyle w:val="Table"/>
-        <w:tblW w:type="auto" w:w="0"/>
-        <w:tblLook w:firstRow="0" w:lastRow="0" w:firstColumn="0" w:lastColumn="0" w:noHBand="0" w:noVBand="0" w:val="0000"/>
-      </w:tblPr>
-      <w:tblGrid>
-        <w:gridCol w:w="3960"/>
-        <w:gridCol w:w="3960"/>
-      </w:tblGrid>
-      <w:tr>
-        <w:tc>
-          <w:tcPr/>
-          <w:p>
-            <w:pPr>
-              <w:pStyle w:val="Compact"/>
-            </w:pPr>
-            <w:r>
-              <w:rPr>
-                <w:b/>
-                <w:bCs/>
-              </w:rPr>
-              <w:t xml:space="preserve">Member 1</w:t>
-            </w:r>
-          </w:p>
-        </w:tc>
-        <w:tc>
-          <w:tcPr/>
-          <w:p>
-            <w:pPr>
-              <w:pStyle w:val="Compact"/>
-            </w:pPr>
-            <w:r>
-              <w:t xml:space="preserve">Anees Saheba Guddi, SID4 5330</w:t>
-            </w:r>
-          </w:p>
-        </w:tc>
-      </w:tr>
-      <w:tr>
-        <w:tc>
-          <w:tcPr/>
-          <w:p>
-            <w:pPr>
-              <w:pStyle w:val="Compact"/>
-            </w:pPr>
-            <w:r>
-              <w:rPr>
-                <w:b/>
-                <w:bCs/>
-              </w:rPr>
-              <w:t xml:space="preserve">Member 2</w:t>
-            </w:r>
-          </w:p>
-        </w:tc>
-        <w:tc>
-          <w:tcPr/>
-          <w:p>
-            <w:pPr>
-              <w:pStyle w:val="Compact"/>
-            </w:pPr>
-            <w:r>
-              <w:t xml:space="preserve">Yashashree Shinde, SID4 4349</w:t>
-            </w:r>
-          </w:p>
-        </w:tc>
-      </w:tr>
-      <w:tr>
-        <w:tc>
-          <w:tcPr/>
-          <w:p>
-            <w:pPr>
-              <w:pStyle w:val="Compact"/>
-            </w:pPr>
-            <w:r>
-              <w:rPr>
-                <w:b/>
-                <w:bCs/>
-              </w:rPr>
-              <w:t xml:space="preserve">Repository</w:t>
-            </w:r>
-          </w:p>
-        </w:tc>
-        <w:tc>
-          <w:tcPr/>
-          <w:p>
-            <w:pPr>
-              <w:pStyle w:val="Compact"/>
-            </w:pPr>
-            <w:r>
-              <w:t xml:space="preserve">https://github.com/aneessaheba/DATA-266-Lab-1</w:t>
-            </w:r>
-          </w:p>
-        </w:tc>
-      </w:tr>
-      <w:tr>
-        <w:tc>
-          <w:tcPr/>
-          <w:p>
-            <w:pPr>
-              <w:pStyle w:val="Compact"/>
-            </w:pPr>
-            <w:r>
-              <w:rPr>
-                <w:b/>
-                <w:bCs/>
-              </w:rPr>
-              <w:t xml:space="preserve">Date</w:t>
-            </w:r>
-          </w:p>
-        </w:tc>
-        <w:tc>
-          <w:tcPr/>
-          <w:p>
-            <w:pPr>
-              <w:pStyle w:val="Compact"/>
-            </w:pPr>
-            <w:r>
-              <w:t xml:space="preserve">6 October 2026</w:t>
-            </w:r>
-          </w:p>
-        </w:tc>
-      </w:tr>
-    </w:tbl>
+        <w:t xml:space="preserve">DATA266 Lab 1: Language Modelling, Sentiment Classification and Unpaired Image Translation</w:t>
+      </w:r>
+    </w:p>
+    <w:p>
+      <w:pPr>
+        <w:pStyle w:val="FirstParagraph"/>
+      </w:pPr>
+      <w:r>
+        <w:t xml:space="preserve">Anees Saheba Guddi (SID4 5330) and Yashashree Shinde (SID4 4349)</w:t>
+      </w:r>
+    </w:p>
+    <w:p>
+      <w:pPr>
+        <w:pStyle w:val="BodyText"/>
+      </w:pPr>
+      <w:r>
+        <w:t xml:space="preserve">Team 8, DATA266, San Jose State University</w:t>
+      </w:r>
+    </w:p>
+    <w:p>
+      <w:pPr>
+        <w:pStyle w:val="BodyText"/>
+      </w:pPr>
+      <w:r>
+        <w:t xml:space="preserve">Repository: https://github.com/aneessaheba/DATA-266-Lab-1</w:t>
+      </w:r>
+    </w:p>
+    <w:p>
+      <w:pPr>
+        <w:pStyle w:val="BodyText"/>
+      </w:pPr>
+      <w:r>
+        <w:rPr>
+          <w:b/>
+          <w:bCs/>
+        </w:rPr>
+        <w:t xml:space="preserve">Abstract</w:t>
+      </w:r>
+      <w:r>
+        <w:t xml:space="preserve">—This report covers three machine learning systems built from</w:t>
+      </w:r>
+      <w:r>
+        <w:t xml:space="preserve"> </w:t>
+      </w:r>
+      <w:r>
+        <w:t xml:space="preserve">scratch by a team of two, with each member independently designing, training</w:t>
+      </w:r>
+      <w:r>
+        <w:t xml:space="preserve"> </w:t>
+      </w:r>
+      <w:r>
+        <w:t xml:space="preserve">and evaluating their own model for every task so that all results appear twice.</w:t>
+      </w:r>
+      <w:r>
+        <w:t xml:space="preserve"> </w:t>
+      </w:r>
+      <w:r>
+        <w:t xml:space="preserve">Task 1 is a character level GPT trained on TinyStories, where the two models</w:t>
+      </w:r>
+      <w:r>
+        <w:t xml:space="preserve"> </w:t>
+      </w:r>
+      <w:r>
+        <w:t xml:space="preserve">reach validation bits per character of 1.0875 and 1.0210. Task 2 is Yelp</w:t>
+      </w:r>
+      <w:r>
+        <w:t xml:space="preserve"> </w:t>
+      </w:r>
+      <w:r>
+        <w:t xml:space="preserve">Polarity sentiment classification with three classifiers per member, where the</w:t>
+      </w:r>
+      <w:r>
+        <w:t xml:space="preserve"> </w:t>
+      </w:r>
+      <w:r>
+        <w:t xml:space="preserve">best model reaches 95.02 percent test accuracy. Task 3 is a CycleGAN for</w:t>
+      </w:r>
+      <w:r>
+        <w:t xml:space="preserve"> </w:t>
+      </w:r>
+      <w:r>
+        <w:t xml:space="preserve">unpaired translation between Monet paintings and photographs, where the two</w:t>
+      </w:r>
+      <w:r>
+        <w:t xml:space="preserve"> </w:t>
+      </w:r>
+      <w:r>
+        <w:t xml:space="preserve">runs reach photo to Monet FID of 86.59 and 92.39 and Kaggle public scores of</w:t>
+      </w:r>
+      <w:r>
+        <w:t xml:space="preserve"> </w:t>
+      </w:r>
+      <w:r>
+        <w:t xml:space="preserve">-52.8390 and -54.6990. Three findings emerged only from comparing the two</w:t>
+      </w:r>
+      <w:r>
+        <w:t xml:space="preserve"> </w:t>
+      </w:r>
+      <w:r>
+        <w:t xml:space="preserve">independent runs: the language model with the better validation loss produces</w:t>
+      </w:r>
+      <w:r>
+        <w:t xml:space="preserve"> </w:t>
+      </w:r>
+      <w:r>
+        <w:t xml:space="preserve">the more repetitive text, mean pooling beats max pooling as a sentiment</w:t>
+      </w:r>
+      <w:r>
+        <w:t xml:space="preserve"> </w:t>
+      </w:r>
+      <w:r>
+        <w:t xml:space="preserve">baseline by 3.6 points, and the CycleGAN identity weight trades style fidelity</w:t>
+      </w:r>
+      <w:r>
+        <w:t xml:space="preserve"> </w:t>
+      </w:r>
+      <w:r>
+        <w:t xml:space="preserve">against cycle reconstruction with each member winning the side their own weight</w:t>
+      </w:r>
+      <w:r>
+        <w:t xml:space="preserve"> </w:t>
+      </w:r>
+      <w:r>
+        <w:t xml:space="preserve">favoured. All reported numbers are traceable to committed files.</w:t>
+      </w:r>
+    </w:p>
+    <w:p>
+      <w:pPr>
+        <w:pStyle w:val="BodyText"/>
+      </w:pPr>
+      <w:r>
+        <w:rPr>
+          <w:b/>
+          <w:bCs/>
+        </w:rPr>
+        <w:t xml:space="preserve">Index Terms</w:t>
+      </w:r>
+      <w:r>
+        <w:t xml:space="preserve">—transformer, causal self attention, character level language</w:t>
+      </w:r>
+      <w:r>
+        <w:t xml:space="preserve"> </w:t>
+      </w:r>
+      <w:r>
+        <w:t xml:space="preserve">model, sentiment classification, recurrent networks, generative adversarial</w:t>
+      </w:r>
+      <w:r>
+        <w:t xml:space="preserve"> </w:t>
+      </w:r>
+      <w:r>
+        <w:t xml:space="preserve">networks, unpaired image translation, cycle consistency, reproducibility.</w:t>
+      </w:r>
+    </w:p>
     <w:bookmarkEnd w:id="9"/>
     <w:bookmarkStart w:id="10" w:name="team-ownership-statement"/>
     <w:p>
       <w:pPr>
-        <w:pStyle w:val="Heading2"/>
-      </w:pPr>
-      <w:r>
-        <w:t xml:space="preserve">Team ownership statement</w:t>
+        <w:pStyle w:val="Heading1"/>
+      </w:pPr>
+      <w:r>
+        <w:t xml:space="preserve">TEAM OWNERSHIP STATEMENT</w:t>
       </w:r>
     </w:p>
     <w:p>
@@ -311,96 +303,88 @@
         <w:t xml:space="preserve">together from both sets of results.</w:t>
       </w:r>
     </w:p>
-    <w:p>
-      <w:r>
-        <w:pict>
-          <v:rect style="width:0;height:1.5pt" o:hralign="center" o:hrstd="t" o:hr="t"/>
-        </w:pict>
-      </w:r>
-    </w:p>
     <w:bookmarkEnd w:id="10"/>
+    <w:bookmarkStart w:id="26" w:name="i.-task-1-character-level-language-model"/>
+    <w:p>
+      <w:pPr>
+        <w:pStyle w:val="Heading1"/>
+      </w:pPr>
+      <w:r>
+        <w:t xml:space="preserve">I. TASK 1: CHARACTER LEVEL LANGUAGE MODEL</w:t>
+      </w:r>
+    </w:p>
+    <w:bookmarkStart w:id="11" w:name="a.-objective"/>
+    <w:p>
+      <w:pPr>
+        <w:pStyle w:val="Heading2"/>
+      </w:pPr>
+      <w:r>
+        <w:t xml:space="preserve">A. Objective</w:t>
+      </w:r>
+    </w:p>
+    <w:p>
+      <w:pPr>
+        <w:pStyle w:val="FirstParagraph"/>
+      </w:pPr>
+      <w:r>
+        <w:t xml:space="preserve">Build a GPT style autoregressive language model from scratch on TinyStories,</w:t>
+      </w:r>
+      <w:r>
+        <w:t xml:space="preserve"> </w:t>
+      </w:r>
+      <w:r>
+        <w:t xml:space="preserve">train it for at least ten epochs, report the full metric list, and analyse</w:t>
+      </w:r>
+      <w:r>
+        <w:t xml:space="preserve"> </w:t>
+      </w:r>
+      <w:r>
+        <w:t xml:space="preserve">three real failure cases from generated text. No prebuilt transformer or</w:t>
+      </w:r>
+      <w:r>
+        <w:t xml:space="preserve"> </w:t>
+      </w:r>
+      <w:r>
+        <w:t xml:space="preserve">attention modules were permitted.</w:t>
+      </w:r>
+    </w:p>
+    <w:p>
+      <w:pPr>
+        <w:pStyle w:val="BodyText"/>
+      </w:pPr>
+      <w:r>
+        <w:t xml:space="preserve">Both members wrote multi head causal self attention with explicit matrix</w:t>
+      </w:r>
+      <w:r>
+        <w:t xml:space="preserve"> </w:t>
+      </w:r>
+      <w:r>
+        <w:t xml:space="preserve">multiplications and verified numerically that no position can attend to a</w:t>
+      </w:r>
+      <w:r>
+        <w:t xml:space="preserve"> </w:t>
+      </w:r>
+      <w:r>
+        <w:t xml:space="preserve">future position.</w:t>
+      </w:r>
+    </w:p>
     <w:bookmarkEnd w:id="11"/>
-    <w:bookmarkStart w:id="27" w:name="Xcabae06508ce27abd27dcef2b245932e2788440"/>
-    <w:p>
-      <w:pPr>
-        <w:pStyle w:val="Heading1"/>
-      </w:pPr>
-      <w:r>
-        <w:t xml:space="preserve">Part 1. Task 1, character level language model from scratch</w:t>
-      </w:r>
-    </w:p>
-    <w:bookmarkStart w:id="12" w:name="objective"/>
+    <w:bookmarkStart w:id="17" w:name="b.-member-1-anees-saheba-guddi"/>
     <w:p>
       <w:pPr>
         <w:pStyle w:val="Heading2"/>
       </w:pPr>
       <w:r>
-        <w:t xml:space="preserve">1.1 Objective</w:t>
-      </w:r>
-    </w:p>
-    <w:p>
-      <w:pPr>
-        <w:pStyle w:val="FirstParagraph"/>
-      </w:pPr>
-      <w:r>
-        <w:t xml:space="preserve">Build a GPT style autoregressive language model from scratch on TinyStories,</w:t>
-      </w:r>
-      <w:r>
-        <w:t xml:space="preserve"> </w:t>
-      </w:r>
-      <w:r>
-        <w:t xml:space="preserve">train it for at least ten epochs, report the full metric list, and analyse</w:t>
-      </w:r>
-      <w:r>
-        <w:t xml:space="preserve"> </w:t>
-      </w:r>
-      <w:r>
-        <w:t xml:space="preserve">three real failure cases from generated text. No prebuilt transformer or</w:t>
-      </w:r>
-      <w:r>
-        <w:t xml:space="preserve"> </w:t>
-      </w:r>
-      <w:r>
-        <w:t xml:space="preserve">attention modules were permitted.</w:t>
-      </w:r>
-    </w:p>
-    <w:p>
-      <w:pPr>
-        <w:pStyle w:val="BodyText"/>
-      </w:pPr>
-      <w:r>
-        <w:t xml:space="preserve">Both members wrote multi head causal self attention with explicit matrix</w:t>
-      </w:r>
-      <w:r>
-        <w:t xml:space="preserve"> </w:t>
-      </w:r>
-      <w:r>
-        <w:t xml:space="preserve">multiplications and verified numerically that no position can attend to a</w:t>
-      </w:r>
-      <w:r>
-        <w:t xml:space="preserve"> </w:t>
-      </w:r>
-      <w:r>
-        <w:t xml:space="preserve">future position.</w:t>
-      </w:r>
-    </w:p>
-    <w:bookmarkEnd w:id="12"/>
-    <w:bookmarkStart w:id="18" w:name="anees-saheba-guddi-task-1"/>
-    <w:p>
-      <w:pPr>
-        <w:pStyle w:val="Heading2"/>
-      </w:pPr>
-      <w:r>
-        <w:t xml:space="preserve">1.2 Anees Saheba Guddi, Task 1</w:t>
-      </w:r>
-    </w:p>
-    <w:bookmarkStart w:id="13" w:name="architecture"/>
+        <w:t xml:space="preserve">B. Member 1: Anees Saheba Guddi</w:t>
+      </w:r>
+    </w:p>
+    <w:bookmarkStart w:id="12" w:name="architecture"/>
     <w:p>
       <w:pPr>
         <w:pStyle w:val="Heading3"/>
       </w:pPr>
       <w:r>
-        <w:t xml:space="preserve">1.2.1 Architecture</w:t>
+        <w:t xml:space="preserve">1) Architecture</w:t>
       </w:r>
     </w:p>
     <w:tbl>
@@ -813,14 +797,14 @@
         <w:t xml:space="preserve">Total: 3,238,912</w:t>
       </w:r>
     </w:p>
-    <w:bookmarkEnd w:id="13"/>
-    <w:bookmarkStart w:id="14" w:name="hyperparameters-and-reasons"/>
+    <w:bookmarkEnd w:id="12"/>
+    <w:bookmarkStart w:id="13" w:name="hyperparameters-and-reasons"/>
     <w:p>
       <w:pPr>
         <w:pStyle w:val="Heading3"/>
       </w:pPr>
       <w:r>
-        <w:t xml:space="preserve">1.2.2 Hyperparameters and reasons</w:t>
+        <w:t xml:space="preserve">2) Hyperparameters and reasons</w:t>
       </w:r>
     </w:p>
     <w:p>
@@ -945,98 +929,98 @@
         <w:t xml:space="preserve">, ten epochs, 15,620 optimiser steps in total.</w:t>
       </w:r>
     </w:p>
+    <w:bookmarkEnd w:id="13"/>
+    <w:bookmarkStart w:id="14" w:name="data-preprocessing"/>
+    <w:p>
+      <w:pPr>
+        <w:pStyle w:val="Heading3"/>
+      </w:pPr>
+      <w:r>
+        <w:t xml:space="preserve">3) Data preprocessing</w:t>
+      </w:r>
+    </w:p>
+    <w:p>
+      <w:pPr>
+        <w:pStyle w:val="FirstParagraph"/>
+      </w:pPr>
+      <w:r>
+        <w:t xml:space="preserve">The source text contained mojibake, UTF-8 that had been decoded as cp1252. He</w:t>
+      </w:r>
+      <w:r>
+        <w:t xml:space="preserve"> </w:t>
+      </w:r>
+      <w:r>
+        <w:t xml:space="preserve">found and repaired it with an explicit byte sequence map.</w:t>
+      </w:r>
+    </w:p>
+    <w:p>
+      <w:pPr>
+        <w:pStyle w:val="Compact"/>
+        <w:numPr>
+          <w:ilvl w:val="0"/>
+          <w:numId w:val="1004"/>
+        </w:numPr>
+      </w:pPr>
+      <w:r>
+        <w:t xml:space="preserve">Before repair: vocabulary of 101 characters, including artifacts such as a</w:t>
+      </w:r>
+      <w:r>
+        <w:t xml:space="preserve"> </w:t>
+      </w:r>
+      <w:r>
+        <w:t xml:space="preserve">three byte sequence standing in for a single quotation mark.</w:t>
+      </w:r>
+    </w:p>
+    <w:p>
+      <w:pPr>
+        <w:pStyle w:val="Compact"/>
+        <w:numPr>
+          <w:ilvl w:val="0"/>
+          <w:numId w:val="1004"/>
+        </w:numPr>
+      </w:pPr>
+      <w:r>
+        <w:t xml:space="preserve">After repair: vocabulary of 91 characters, zero markers remaining.</w:t>
+      </w:r>
+    </w:p>
+    <w:p>
+      <w:pPr>
+        <w:pStyle w:val="Compact"/>
+        <w:numPr>
+          <w:ilvl w:val="0"/>
+          <w:numId w:val="1004"/>
+        </w:numPr>
+      </w:pPr>
+      <w:r>
+        <w:t xml:space="preserve">The first repair attempt silently failed because it encoded as Latin 1, where</w:t>
+      </w:r>
+      <w:r>
+        <w:t xml:space="preserve"> </w:t>
+      </w:r>
+      <w:r>
+        <w:t xml:space="preserve">the characters involved are cp1252 only, so the encode raised and the</w:t>
+      </w:r>
+      <w:r>
+        <w:t xml:space="preserve"> </w:t>
+      </w:r>
+      <w:r>
+        <w:t xml:space="preserve">function returned the text unchanged. The bug was caught because the</w:t>
+      </w:r>
+      <w:r>
+        <w:t xml:space="preserve"> </w:t>
+      </w:r>
+      <w:r>
+        <w:t xml:space="preserve">vocabulary size did not drop.</w:t>
+      </w:r>
+    </w:p>
     <w:bookmarkEnd w:id="14"/>
-    <w:bookmarkStart w:id="15" w:name="data-preprocessing"/>
+    <w:bookmarkStart w:id="15" w:name="results"/>
     <w:p>
       <w:pPr>
         <w:pStyle w:val="Heading3"/>
       </w:pPr>
       <w:r>
-        <w:t xml:space="preserve">1.2.3 Data preprocessing</w:t>
-      </w:r>
-    </w:p>
-    <w:p>
-      <w:pPr>
-        <w:pStyle w:val="FirstParagraph"/>
-      </w:pPr>
-      <w:r>
-        <w:t xml:space="preserve">The source text contained mojibake, UTF-8 that had been decoded as cp1252. He</w:t>
-      </w:r>
-      <w:r>
-        <w:t xml:space="preserve"> </w:t>
-      </w:r>
-      <w:r>
-        <w:t xml:space="preserve">found and repaired it with an explicit byte sequence map.</w:t>
-      </w:r>
-    </w:p>
-    <w:p>
-      <w:pPr>
-        <w:pStyle w:val="Compact"/>
-        <w:numPr>
-          <w:ilvl w:val="0"/>
-          <w:numId w:val="1004"/>
-        </w:numPr>
-      </w:pPr>
-      <w:r>
-        <w:t xml:space="preserve">Before repair: vocabulary of 101 characters, including artifacts such as a</w:t>
-      </w:r>
-      <w:r>
-        <w:t xml:space="preserve"> </w:t>
-      </w:r>
-      <w:r>
-        <w:t xml:space="preserve">three byte sequence standing in for a single quotation mark.</w:t>
-      </w:r>
-    </w:p>
-    <w:p>
-      <w:pPr>
-        <w:pStyle w:val="Compact"/>
-        <w:numPr>
-          <w:ilvl w:val="0"/>
-          <w:numId w:val="1004"/>
-        </w:numPr>
-      </w:pPr>
-      <w:r>
-        <w:t xml:space="preserve">After repair: vocabulary of 91 characters, zero markers remaining.</w:t>
-      </w:r>
-    </w:p>
-    <w:p>
-      <w:pPr>
-        <w:pStyle w:val="Compact"/>
-        <w:numPr>
-          <w:ilvl w:val="0"/>
-          <w:numId w:val="1004"/>
-        </w:numPr>
-      </w:pPr>
-      <w:r>
-        <w:t xml:space="preserve">The first repair attempt silently failed because it encoded as Latin 1, where</w:t>
-      </w:r>
-      <w:r>
-        <w:t xml:space="preserve"> </w:t>
-      </w:r>
-      <w:r>
-        <w:t xml:space="preserve">the characters involved are cp1252 only, so the encode raised and the</w:t>
-      </w:r>
-      <w:r>
-        <w:t xml:space="preserve"> </w:t>
-      </w:r>
-      <w:r>
-        <w:t xml:space="preserve">function returned the text unchanged. The bug was caught because the</w:t>
-      </w:r>
-      <w:r>
-        <w:t xml:space="preserve"> </w:t>
-      </w:r>
-      <w:r>
-        <w:t xml:space="preserve">vocabulary size did not drop.</w:t>
-      </w:r>
-    </w:p>
-    <w:bookmarkEnd w:id="15"/>
-    <w:bookmarkStart w:id="16" w:name="results"/>
-    <w:p>
-      <w:pPr>
-        <w:pStyle w:val="Heading3"/>
-      </w:pPr>
-      <w:r>
-        <w:t xml:space="preserve">1.2.4 Results</w:t>
+        <w:t xml:space="preserve">4) Results</w:t>
       </w:r>
     </w:p>
     <w:tbl>
@@ -1849,14 +1833,14 @@
         </w:tc>
       </w:tr>
     </w:tbl>
-    <w:bookmarkEnd w:id="16"/>
-    <w:bookmarkStart w:id="17" w:name="failure-analysis"/>
+    <w:bookmarkEnd w:id="15"/>
+    <w:bookmarkStart w:id="16" w:name="failure-analysis"/>
     <w:p>
       <w:pPr>
         <w:pStyle w:val="Heading3"/>
       </w:pPr>
       <w:r>
-        <w:t xml:space="preserve">1.2.5 Failure analysis</w:t>
+        <w:t xml:space="preserve">5) Failure analysis</w:t>
       </w:r>
     </w:p>
     <w:p>
@@ -2297,24 +2281,24 @@
         <w:t xml:space="preserve">first change he would test.</w:t>
       </w:r>
     </w:p>
+    <w:bookmarkEnd w:id="16"/>
     <w:bookmarkEnd w:id="17"/>
-    <w:bookmarkEnd w:id="18"/>
-    <w:bookmarkStart w:id="24" w:name="yashashree-shinde-task-1"/>
+    <w:bookmarkStart w:id="23" w:name="c.-member-2-yashashree-shinde"/>
     <w:p>
       <w:pPr>
         <w:pStyle w:val="Heading2"/>
       </w:pPr>
       <w:r>
-        <w:t xml:space="preserve">1.3 Yashashree Shinde, Task 1</w:t>
-      </w:r>
-    </w:p>
-    <w:bookmarkStart w:id="19" w:name="architecture-1"/>
+        <w:t xml:space="preserve">C. Member 2: Yashashree Shinde</w:t>
+      </w:r>
+    </w:p>
+    <w:bookmarkStart w:id="18" w:name="architecture-1"/>
     <w:p>
       <w:pPr>
         <w:pStyle w:val="Heading3"/>
       </w:pPr>
       <w:r>
-        <w:t xml:space="preserve">1.3.1 Architecture</w:t>
+        <w:t xml:space="preserve">1) Architecture</w:t>
       </w:r>
     </w:p>
     <w:tbl>
@@ -2643,14 +2627,14 @@
         </w:tc>
       </w:tr>
     </w:tbl>
-    <w:bookmarkEnd w:id="19"/>
-    <w:bookmarkStart w:id="20" w:name="hyperparameters-and-reasons-1"/>
+    <w:bookmarkEnd w:id="18"/>
+    <w:bookmarkStart w:id="19" w:name="hyperparameters-and-reasons-1"/>
     <w:p>
       <w:pPr>
         <w:pStyle w:val="Heading3"/>
       </w:pPr>
       <w:r>
-        <w:t xml:space="preserve">1.3.2 Hyperparameters and reasons</w:t>
+        <w:t xml:space="preserve">2) Hyperparameters and reasons</w:t>
       </w:r>
     </w:p>
     <w:p>
@@ -2781,90 +2765,90 @@
         <w:t xml:space="preserve">context length, so that the two runs differ along a meaningful axis.</w:t>
       </w:r>
     </w:p>
+    <w:bookmarkEnd w:id="19"/>
+    <w:bookmarkStart w:id="20" w:name="data-preprocessing-1"/>
+    <w:p>
+      <w:pPr>
+        <w:pStyle w:val="Heading3"/>
+      </w:pPr>
+      <w:r>
+        <w:t xml:space="preserve">3) Data preprocessing</w:t>
+      </w:r>
+    </w:p>
+    <w:p>
+      <w:pPr>
+        <w:pStyle w:val="Compact"/>
+        <w:numPr>
+          <w:ilvl w:val="0"/>
+          <w:numId w:val="1010"/>
+        </w:numPr>
+      </w:pPr>
+      <w:r>
+        <w:t xml:space="preserve">Dataset: TinyStories, character level tokenisation.</w:t>
+      </w:r>
+    </w:p>
+    <w:p>
+      <w:pPr>
+        <w:pStyle w:val="Compact"/>
+        <w:numPr>
+          <w:ilvl w:val="0"/>
+          <w:numId w:val="1010"/>
+        </w:numPr>
+      </w:pPr>
+      <w:r>
+        <w:t xml:space="preserve">Training sequences: 100,000. Validation sequences: 10,000.</w:t>
+      </w:r>
+    </w:p>
+    <w:p>
+      <w:pPr>
+        <w:pStyle w:val="Compact"/>
+        <w:numPr>
+          <w:ilvl w:val="0"/>
+          <w:numId w:val="1010"/>
+        </w:numPr>
+      </w:pPr>
+      <w:r>
+        <w:t xml:space="preserve">Sequence input length: 256.</w:t>
+      </w:r>
+    </w:p>
+    <w:p>
+      <w:pPr>
+        <w:pStyle w:val="Compact"/>
+        <w:numPr>
+          <w:ilvl w:val="0"/>
+          <w:numId w:val="1010"/>
+        </w:numPr>
+      </w:pPr>
+      <w:r>
+        <w:t xml:space="preserve">Train and validation split independently shuffled using seed 4349.</w:t>
+      </w:r>
+    </w:p>
+    <w:p>
+      <w:pPr>
+        <w:pStyle w:val="Compact"/>
+        <w:numPr>
+          <w:ilvl w:val="0"/>
+          <w:numId w:val="1010"/>
+        </w:numPr>
+      </w:pPr>
+      <w:r>
+        <w:t xml:space="preserve">The mojibake present in the source text was not repaired, so her vocabulary</w:t>
+      </w:r>
+      <w:r>
+        <w:t xml:space="preserve"> </w:t>
+      </w:r>
+      <w:r>
+        <w:t xml:space="preserve">of 101 includes the corrupted sequences as if they were real characters.</w:t>
+      </w:r>
+    </w:p>
     <w:bookmarkEnd w:id="20"/>
-    <w:bookmarkStart w:id="21" w:name="data-preprocessing-1"/>
+    <w:bookmarkStart w:id="21" w:name="results-1"/>
     <w:p>
       <w:pPr>
         <w:pStyle w:val="Heading3"/>
       </w:pPr>
       <w:r>
-        <w:t xml:space="preserve">1.3.3 Data preprocessing</w:t>
-      </w:r>
-    </w:p>
-    <w:p>
-      <w:pPr>
-        <w:pStyle w:val="Compact"/>
-        <w:numPr>
-          <w:ilvl w:val="0"/>
-          <w:numId w:val="1010"/>
-        </w:numPr>
-      </w:pPr>
-      <w:r>
-        <w:t xml:space="preserve">Dataset: TinyStories, character level tokenisation.</w:t>
-      </w:r>
-    </w:p>
-    <w:p>
-      <w:pPr>
-        <w:pStyle w:val="Compact"/>
-        <w:numPr>
-          <w:ilvl w:val="0"/>
-          <w:numId w:val="1010"/>
-        </w:numPr>
-      </w:pPr>
-      <w:r>
-        <w:t xml:space="preserve">Training sequences: 100,000. Validation sequences: 10,000.</w:t>
-      </w:r>
-    </w:p>
-    <w:p>
-      <w:pPr>
-        <w:pStyle w:val="Compact"/>
-        <w:numPr>
-          <w:ilvl w:val="0"/>
-          <w:numId w:val="1010"/>
-        </w:numPr>
-      </w:pPr>
-      <w:r>
-        <w:t xml:space="preserve">Sequence input length: 256.</w:t>
-      </w:r>
-    </w:p>
-    <w:p>
-      <w:pPr>
-        <w:pStyle w:val="Compact"/>
-        <w:numPr>
-          <w:ilvl w:val="0"/>
-          <w:numId w:val="1010"/>
-        </w:numPr>
-      </w:pPr>
-      <w:r>
-        <w:t xml:space="preserve">Train and validation split independently shuffled using seed 4349.</w:t>
-      </w:r>
-    </w:p>
-    <w:p>
-      <w:pPr>
-        <w:pStyle w:val="Compact"/>
-        <w:numPr>
-          <w:ilvl w:val="0"/>
-          <w:numId w:val="1010"/>
-        </w:numPr>
-      </w:pPr>
-      <w:r>
-        <w:t xml:space="preserve">The mojibake present in the source text was not repaired, so her vocabulary</w:t>
-      </w:r>
-      <w:r>
-        <w:t xml:space="preserve"> </w:t>
-      </w:r>
-      <w:r>
-        <w:t xml:space="preserve">of 101 includes the corrupted sequences as if they were real characters.</w:t>
-      </w:r>
-    </w:p>
-    <w:bookmarkEnd w:id="21"/>
-    <w:bookmarkStart w:id="22" w:name="results-1"/>
-    <w:p>
-      <w:pPr>
-        <w:pStyle w:val="Heading3"/>
-      </w:pPr>
-      <w:r>
-        <w:t xml:space="preserve">1.3.4 Results</w:t>
+        <w:t xml:space="preserve">4) Results</w:t>
       </w:r>
     </w:p>
     <w:tbl>
@@ -3479,14 +3463,14 @@
         </w:tc>
       </w:tr>
     </w:tbl>
-    <w:bookmarkEnd w:id="22"/>
-    <w:bookmarkStart w:id="23" w:name="failure-analysis-1"/>
+    <w:bookmarkEnd w:id="21"/>
+    <w:bookmarkStart w:id="22" w:name="failure-analysis-1"/>
     <w:p>
       <w:pPr>
         <w:pStyle w:val="Heading3"/>
       </w:pPr>
       <w:r>
-        <w:t xml:space="preserve">1.3.5 Failure analysis</w:t>
+        <w:t xml:space="preserve">5) Failure analysis</w:t>
       </w:r>
     </w:p>
     <w:p>
@@ -3771,15 +3755,15 @@
         <w:t xml:space="preserve">better context quality, longer training.</w:t>
       </w:r>
     </w:p>
+    <w:bookmarkEnd w:id="22"/>
     <w:bookmarkEnd w:id="23"/>
-    <w:bookmarkEnd w:id="24"/>
-    <w:bookmarkStart w:id="25" w:name="task-1-comparison-table"/>
+    <w:bookmarkStart w:id="24" w:name="d.-side-by-side-comparison"/>
     <w:p>
       <w:pPr>
         <w:pStyle w:val="Heading2"/>
       </w:pPr>
       <w:r>
-        <w:t xml:space="preserve">1.4 Task 1 comparison table</w:t>
+        <w:t xml:space="preserve">D. Side by Side Comparison</w:t>
       </w:r>
     </w:p>
     <w:tbl>
@@ -4942,14 +4926,14 @@
         </w:tc>
       </w:tr>
     </w:tbl>
-    <w:bookmarkEnd w:id="25"/>
-    <w:bookmarkStart w:id="26" w:name="task-1-joint-analysis"/>
+    <w:bookmarkEnd w:id="24"/>
+    <w:bookmarkStart w:id="25" w:name="e.-joint-analysis"/>
     <w:p>
       <w:pPr>
         <w:pStyle w:val="Heading2"/>
       </w:pPr>
       <w:r>
-        <w:t xml:space="preserve">1.5 Task 1 joint analysis</w:t>
+        <w:t xml:space="preserve">E. Joint Analysis</w:t>
       </w:r>
     </w:p>
     <w:p>
@@ -5342,76 +5326,69 @@
         <w:t xml:space="preserve">Measuring repetition at matched perplexity rather than matched temperature.</w:t>
       </w:r>
     </w:p>
-    <w:p>
-      <w:r>
-        <w:pict>
-          <v:rect style="width:0;height:1.5pt" o:hralign="center" o:hrstd="t" o:hr="t"/>
-        </w:pict>
-      </w:r>
-    </w:p>
+    <w:bookmarkEnd w:id="25"/>
     <w:bookmarkEnd w:id="26"/>
+    <w:bookmarkStart w:id="40" w:name="X2cebc2794bdbf50d8772ae559a484a5ed2c0cc9"/>
+    <w:p>
+      <w:pPr>
+        <w:pStyle w:val="Heading1"/>
+      </w:pPr>
+      <w:r>
+        <w:t xml:space="preserve">II. TASK 2: YELP POLARITY SENTIMENT CLASSIFICATION</w:t>
+      </w:r>
+    </w:p>
+    <w:bookmarkStart w:id="27" w:name="a.-objective-1"/>
+    <w:p>
+      <w:pPr>
+        <w:pStyle w:val="Heading2"/>
+      </w:pPr>
+      <w:r>
+        <w:t xml:space="preserve">A. Objective</w:t>
+      </w:r>
+    </w:p>
+    <w:p>
+      <w:pPr>
+        <w:pStyle w:val="FirstParagraph"/>
+      </w:pPr>
+      <w:r>
+        <w:t xml:space="preserve">Train three sentiment classifiers per member on Yelp Polarity, with no</w:t>
+      </w:r>
+      <w:r>
+        <w:t xml:space="preserve"> </w:t>
+      </w:r>
+      <w:r>
+        <w:t xml:space="preserve">pretrained embeddings and no pretrained language model, report the full metric</w:t>
+      </w:r>
+      <w:r>
+        <w:t xml:space="preserve"> </w:t>
+      </w:r>
+      <w:r>
+        <w:t xml:space="preserve">list per model, and manually review twenty of each member’s own errors in four</w:t>
+      </w:r>
+      <w:r>
+        <w:t xml:space="preserve"> </w:t>
+      </w:r>
+      <w:r>
+        <w:t xml:space="preserve">fixed categories.</w:t>
+      </w:r>
+    </w:p>
     <w:bookmarkEnd w:id="27"/>
-    <w:bookmarkStart w:id="41" w:name="X32730c75310354017f71ec0c2f7600d082209c6"/>
-    <w:p>
-      <w:pPr>
-        <w:pStyle w:val="Heading1"/>
-      </w:pPr>
-      <w:r>
-        <w:t xml:space="preserve">Part 2. Task 2, Yelp Polarity sentiment classification</w:t>
-      </w:r>
-    </w:p>
-    <w:bookmarkStart w:id="28" w:name="objective-1"/>
+    <w:bookmarkStart w:id="32" w:name="b.-member-1-anees-saheba-guddi-1"/>
     <w:p>
       <w:pPr>
         <w:pStyle w:val="Heading2"/>
       </w:pPr>
       <w:r>
-        <w:t xml:space="preserve">2.1 Objective</w:t>
-      </w:r>
-    </w:p>
-    <w:p>
-      <w:pPr>
-        <w:pStyle w:val="FirstParagraph"/>
-      </w:pPr>
-      <w:r>
-        <w:t xml:space="preserve">Train three sentiment classifiers per member on Yelp Polarity, with no</w:t>
-      </w:r>
-      <w:r>
-        <w:t xml:space="preserve"> </w:t>
-      </w:r>
-      <w:r>
-        <w:t xml:space="preserve">pretrained embeddings and no pretrained language model, report the full metric</w:t>
-      </w:r>
-      <w:r>
-        <w:t xml:space="preserve"> </w:t>
-      </w:r>
-      <w:r>
-        <w:t xml:space="preserve">list per model, and manually review twenty of each member’s own errors in four</w:t>
-      </w:r>
-      <w:r>
-        <w:t xml:space="preserve"> </w:t>
-      </w:r>
-      <w:r>
-        <w:t xml:space="preserve">fixed categories.</w:t>
-      </w:r>
-    </w:p>
-    <w:bookmarkEnd w:id="28"/>
-    <w:bookmarkStart w:id="33" w:name="anees-saheba-guddi-task-2"/>
-    <w:p>
-      <w:pPr>
-        <w:pStyle w:val="Heading2"/>
-      </w:pPr>
-      <w:r>
-        <w:t xml:space="preserve">2.2 Anees Saheba Guddi, Task 2</w:t>
-      </w:r>
-    </w:p>
-    <w:bookmarkStart w:id="29" w:name="models"/>
+        <w:t xml:space="preserve">B. Member 1: Anees Saheba Guddi</w:t>
+      </w:r>
+    </w:p>
+    <w:bookmarkStart w:id="28" w:name="models"/>
     <w:p>
       <w:pPr>
         <w:pStyle w:val="Heading3"/>
       </w:pPr>
       <w:r>
-        <w:t xml:space="preserve">2.2.1 Models</w:t>
+        <w:t xml:space="preserve">1) Models</w:t>
       </w:r>
     </w:p>
     <w:tbl>
@@ -5832,14 +5809,14 @@
         <w:t xml:space="preserve">change the baseline prediction, and the measured difference is exactly 0.0.</w:t>
       </w:r>
     </w:p>
-    <w:bookmarkEnd w:id="29"/>
-    <w:bookmarkStart w:id="30" w:name="preprocessing-and-hyperparameters"/>
+    <w:bookmarkEnd w:id="28"/>
+    <w:bookmarkStart w:id="29" w:name="preprocessing-and-hyperparameters"/>
     <w:p>
       <w:pPr>
         <w:pStyle w:val="Heading3"/>
       </w:pPr>
       <w:r>
-        <w:t xml:space="preserve">2.2.2 Preprocessing and hyperparameters</w:t>
+        <w:t xml:space="preserve">2) Preprocessing and hyperparameters</w:t>
       </w:r>
     </w:p>
     <w:p>
@@ -5979,14 +5956,14 @@
         <w:t xml:space="preserve">positive.</w:t>
       </w:r>
     </w:p>
-    <w:bookmarkEnd w:id="30"/>
-    <w:bookmarkStart w:id="31" w:name="results-2"/>
+    <w:bookmarkEnd w:id="29"/>
+    <w:bookmarkStart w:id="30" w:name="results-2"/>
     <w:p>
       <w:pPr>
         <w:pStyle w:val="Heading3"/>
       </w:pPr>
       <w:r>
-        <w:t xml:space="preserve">2.2.3 Results</w:t>
+        <w:t xml:space="preserve">3) Results</w:t>
       </w:r>
     </w:p>
     <w:tbl>
@@ -7097,14 +7074,14 @@
         </w:tc>
       </w:tr>
     </w:tbl>
-    <w:bookmarkEnd w:id="31"/>
-    <w:bookmarkStart w:id="32" w:name="error-review-twenty-errors"/>
+    <w:bookmarkEnd w:id="30"/>
+    <w:bookmarkStart w:id="31" w:name="error-review-twenty-errors"/>
     <w:p>
       <w:pPr>
         <w:pStyle w:val="Heading3"/>
       </w:pPr>
       <w:r>
-        <w:t xml:space="preserve">2.2.4 Error review, twenty errors</w:t>
+        <w:t xml:space="preserve">4) Error review, twenty errors</w:t>
       </w:r>
     </w:p>
     <w:p>
@@ -7543,24 +7520,24 @@
         <w:t xml:space="preserve">the length limit is the obvious fix and the wrong one.</w:t>
       </w:r>
     </w:p>
+    <w:bookmarkEnd w:id="31"/>
     <w:bookmarkEnd w:id="32"/>
-    <w:bookmarkEnd w:id="33"/>
-    <w:bookmarkStart w:id="38" w:name="yashashree-shinde-task-2"/>
+    <w:bookmarkStart w:id="37" w:name="c.-member-2-yashashree-shinde-1"/>
     <w:p>
       <w:pPr>
         <w:pStyle w:val="Heading2"/>
       </w:pPr>
       <w:r>
-        <w:t xml:space="preserve">2.3 Yashashree Shinde, Task 2</w:t>
-      </w:r>
-    </w:p>
-    <w:bookmarkStart w:id="34" w:name="models-1"/>
+        <w:t xml:space="preserve">C. Member 2: Yashashree Shinde</w:t>
+      </w:r>
+    </w:p>
+    <w:bookmarkStart w:id="33" w:name="models-1"/>
     <w:p>
       <w:pPr>
         <w:pStyle w:val="Heading3"/>
       </w:pPr>
       <w:r>
-        <w:t xml:space="preserve">2.3.1 Models</w:t>
+        <w:t xml:space="preserve">1) Models</w:t>
       </w:r>
     </w:p>
     <w:tbl>
@@ -7827,14 +7804,14 @@
         <w:t xml:space="preserve">represent word order and carry negation scope across a span.</w:t>
       </w:r>
     </w:p>
-    <w:bookmarkEnd w:id="34"/>
-    <w:bookmarkStart w:id="35" w:name="preprocessing-and-hyperparameters-1"/>
+    <w:bookmarkEnd w:id="33"/>
+    <w:bookmarkStart w:id="34" w:name="preprocessing-and-hyperparameters-1"/>
     <w:p>
       <w:pPr>
         <w:pStyle w:val="Heading3"/>
       </w:pPr>
       <w:r>
-        <w:t xml:space="preserve">2.3.2 Preprocessing and hyperparameters</w:t>
+        <w:t xml:space="preserve">2) Preprocessing and hyperparameters</w:t>
       </w:r>
     </w:p>
     <w:p>
@@ -7931,14 +7908,14 @@
         <w:t xml:space="preserve">Validation fraction 0.10, bootstrap samples 1,000.</w:t>
       </w:r>
     </w:p>
-    <w:bookmarkEnd w:id="35"/>
-    <w:bookmarkStart w:id="36" w:name="results-3"/>
+    <w:bookmarkEnd w:id="34"/>
+    <w:bookmarkStart w:id="35" w:name="results-3"/>
     <w:p>
       <w:pPr>
         <w:pStyle w:val="Heading3"/>
       </w:pPr>
       <w:r>
-        <w:t xml:space="preserve">2.3.3 Results</w:t>
+        <w:t xml:space="preserve">3) Results</w:t>
       </w:r>
     </w:p>
     <w:tbl>
@@ -9120,14 +9097,14 @@
         </w:tc>
       </w:tr>
     </w:tbl>
-    <w:bookmarkEnd w:id="36"/>
-    <w:bookmarkStart w:id="37" w:name="error-review-twenty-errors-1"/>
+    <w:bookmarkEnd w:id="35"/>
+    <w:bookmarkStart w:id="36" w:name="error-review-twenty-errors-1"/>
     <w:p>
       <w:pPr>
         <w:pStyle w:val="Heading3"/>
       </w:pPr>
       <w:r>
-        <w:t xml:space="preserve">2.3.4 Error review, twenty errors</w:t>
+        <w:t xml:space="preserve">4) Error review, twenty errors</w:t>
       </w:r>
     </w:p>
     <w:p>
@@ -9596,15 +9573,15 @@
         <w:t xml:space="preserve">sit at exactly her 256 token limit.</w:t>
       </w:r>
     </w:p>
+    <w:bookmarkEnd w:id="36"/>
     <w:bookmarkEnd w:id="37"/>
-    <w:bookmarkEnd w:id="38"/>
-    <w:bookmarkStart w:id="39" w:name="task-2-comparison-table"/>
+    <w:bookmarkStart w:id="38" w:name="d.-side-by-side-comparison-1"/>
     <w:p>
       <w:pPr>
         <w:pStyle w:val="Heading2"/>
       </w:pPr>
       <w:r>
-        <w:t xml:space="preserve">2.4 Task 2 comparison table</w:t>
+        <w:t xml:space="preserve">D. Side by Side Comparison</w:t>
       </w:r>
     </w:p>
     <w:tbl>
@@ -11153,14 +11130,14 @@
         </w:tc>
       </w:tr>
     </w:tbl>
-    <w:bookmarkEnd w:id="39"/>
-    <w:bookmarkStart w:id="40" w:name="task-2-joint-analysis"/>
+    <w:bookmarkEnd w:id="38"/>
+    <w:bookmarkStart w:id="39" w:name="e.-joint-analysis-1"/>
     <w:p>
       <w:pPr>
         <w:pStyle w:val="Heading2"/>
       </w:pPr>
       <w:r>
-        <w:t xml:space="preserve">2.5 Task 2 joint analysis</w:t>
+        <w:t xml:space="preserve">E. Joint Analysis</w:t>
       </w:r>
     </w:p>
     <w:p>
@@ -11705,90 +11682,83 @@
         <w:t xml:space="preserve">maximum of p and 1 minus p rather than p of the positive class.</w:t>
       </w:r>
     </w:p>
-    <w:p>
-      <w:r>
-        <w:pict>
-          <v:rect style="width:0;height:1.5pt" o:hralign="center" o:hrstd="t" o:hr="t"/>
-        </w:pict>
-      </w:r>
-    </w:p>
+    <w:bookmarkEnd w:id="39"/>
     <w:bookmarkEnd w:id="40"/>
+    <w:bookmarkStart w:id="54" w:name="X5fa90fecd73043b209734526fc2973c35b67be4"/>
+    <w:p>
+      <w:pPr>
+        <w:pStyle w:val="Heading1"/>
+      </w:pPr>
+      <w:r>
+        <w:t xml:space="preserve">III. TASK 3: CYCLEGAN MONET AND PHOTO STYLE TRANSFER</w:t>
+      </w:r>
+    </w:p>
+    <w:bookmarkStart w:id="41" w:name="a.-objective-2"/>
+    <w:p>
+      <w:pPr>
+        <w:pStyle w:val="Heading2"/>
+      </w:pPr>
+      <w:r>
+        <w:t xml:space="preserve">A. Objective</w:t>
+      </w:r>
+    </w:p>
+    <w:p>
+      <w:pPr>
+        <w:pStyle w:val="FirstParagraph"/>
+      </w:pPr>
+      <w:r>
+        <w:t xml:space="preserve">Train a CycleGAN from scratch to translate in both directions between Monet</w:t>
+      </w:r>
+      <w:r>
+        <w:t xml:space="preserve"> </w:t>
+      </w:r>
+      <w:r>
+        <w:t xml:space="preserve">paintings and photographs, report the full metric list in both directions,</w:t>
+      </w:r>
+      <w:r>
+        <w:t xml:space="preserve"> </w:t>
+      </w:r>
+      <w:r>
+        <w:t xml:space="preserve">verify cycle consistency, analyse visual failure cases, and submit to the</w:t>
+      </w:r>
+      <w:r>
+        <w:t xml:space="preserve"> </w:t>
+      </w:r>
+      <w:r>
+        <w:t xml:space="preserve">Kaggle class competition.</w:t>
+      </w:r>
+    </w:p>
+    <w:p>
+      <w:pPr>
+        <w:pStyle w:val="BodyText"/>
+      </w:pPr>
+      <w:r>
+        <w:t xml:space="preserve">The data is unpaired, so no photograph is the same scene as any painting and</w:t>
+      </w:r>
+      <w:r>
+        <w:t xml:space="preserve"> </w:t>
+      </w:r>
+      <w:r>
+        <w:t xml:space="preserve">there is no target image to compare an output against.</w:t>
+      </w:r>
+    </w:p>
     <w:bookmarkEnd w:id="41"/>
-    <w:bookmarkStart w:id="55" w:name="X577cdc303410e116c18b6f5e81e3c9ea7a09e57"/>
-    <w:p>
-      <w:pPr>
-        <w:pStyle w:val="Heading1"/>
-      </w:pPr>
-      <w:r>
-        <w:t xml:space="preserve">Part 3. Task 3, CycleGAN Monet and photo style transfer</w:t>
-      </w:r>
-    </w:p>
-    <w:bookmarkStart w:id="42" w:name="objective-2"/>
+    <w:bookmarkStart w:id="46" w:name="b.-member-1-anees-saheba-guddi-2"/>
     <w:p>
       <w:pPr>
         <w:pStyle w:val="Heading2"/>
       </w:pPr>
       <w:r>
-        <w:t xml:space="preserve">3.1 Objective</w:t>
-      </w:r>
-    </w:p>
-    <w:p>
-      <w:pPr>
-        <w:pStyle w:val="FirstParagraph"/>
-      </w:pPr>
-      <w:r>
-        <w:t xml:space="preserve">Train a CycleGAN from scratch to translate in both directions between Monet</w:t>
-      </w:r>
-      <w:r>
-        <w:t xml:space="preserve"> </w:t>
-      </w:r>
-      <w:r>
-        <w:t xml:space="preserve">paintings and photographs, report the full metric list in both directions,</w:t>
-      </w:r>
-      <w:r>
-        <w:t xml:space="preserve"> </w:t>
-      </w:r>
-      <w:r>
-        <w:t xml:space="preserve">verify cycle consistency, analyse visual failure cases, and submit to the</w:t>
-      </w:r>
-      <w:r>
-        <w:t xml:space="preserve"> </w:t>
-      </w:r>
-      <w:r>
-        <w:t xml:space="preserve">Kaggle class competition.</w:t>
-      </w:r>
-    </w:p>
-    <w:p>
-      <w:pPr>
-        <w:pStyle w:val="BodyText"/>
-      </w:pPr>
-      <w:r>
-        <w:t xml:space="preserve">The data is unpaired, so no photograph is the same scene as any painting and</w:t>
-      </w:r>
-      <w:r>
-        <w:t xml:space="preserve"> </w:t>
-      </w:r>
-      <w:r>
-        <w:t xml:space="preserve">there is no target image to compare an output against.</w:t>
-      </w:r>
-    </w:p>
-    <w:bookmarkEnd w:id="42"/>
-    <w:bookmarkStart w:id="47" w:name="anees-saheba-guddi-task-3"/>
-    <w:p>
-      <w:pPr>
-        <w:pStyle w:val="Heading2"/>
-      </w:pPr>
-      <w:r>
-        <w:t xml:space="preserve">3.2 Anees Saheba Guddi, Task 3</w:t>
-      </w:r>
-    </w:p>
-    <w:bookmarkStart w:id="43" w:name="architecture-2"/>
+        <w:t xml:space="preserve">B. Member 1: Anees Saheba Guddi</w:t>
+      </w:r>
+    </w:p>
+    <w:bookmarkStart w:id="42" w:name="architecture-2"/>
     <w:p>
       <w:pPr>
         <w:pStyle w:val="Heading3"/>
       </w:pPr>
       <w:r>
-        <w:t xml:space="preserve">3.2.1 Architecture</w:t>
+        <w:t xml:space="preserve">1) Architecture</w:t>
       </w:r>
     </w:p>
     <w:tbl>
@@ -12231,14 +12201,14 @@
         <w:t xml:space="preserve">right.</w:t>
       </w:r>
     </w:p>
-    <w:bookmarkEnd w:id="43"/>
-    <w:bookmarkStart w:id="44" w:name="hyperparameters"/>
+    <w:bookmarkEnd w:id="42"/>
+    <w:bookmarkStart w:id="43" w:name="hyperparameters"/>
     <w:p>
       <w:pPr>
         <w:pStyle w:val="Heading3"/>
       </w:pPr>
       <w:r>
-        <w:t xml:space="preserve">3.2.2 Hyperparameters</w:t>
+        <w:t xml:space="preserve">2) Hyperparameters</w:t>
       </w:r>
     </w:p>
     <w:tbl>
@@ -12597,14 +12567,14 @@
         <w:t xml:space="preserve">measurement. Lowering it frees the generator to repaint.</w:t>
       </w:r>
     </w:p>
-    <w:bookmarkEnd w:id="44"/>
-    <w:bookmarkStart w:id="45" w:name="results-4"/>
+    <w:bookmarkEnd w:id="43"/>
+    <w:bookmarkStart w:id="44" w:name="results-4"/>
     <w:p>
       <w:pPr>
         <w:pStyle w:val="Heading3"/>
       </w:pPr>
       <w:r>
-        <w:t xml:space="preserve">3.2.3 Results</w:t>
+        <w:t xml:space="preserve">3) Results</w:t>
       </w:r>
     </w:p>
     <w:tbl>
@@ -13715,14 +13685,14 @@
         <w:t xml:space="preserve">FID 115.0328, each on 300 pairs</w:t>
       </w:r>
     </w:p>
-    <w:bookmarkEnd w:id="45"/>
-    <w:bookmarkStart w:id="46" w:name="failure-analysis-2"/>
+    <w:bookmarkEnd w:id="44"/>
+    <w:bookmarkStart w:id="45" w:name="failure-analysis-2"/>
     <w:p>
       <w:pPr>
         <w:pStyle w:val="Heading3"/>
       </w:pPr>
       <w:r>
-        <w:t xml:space="preserve">3.2.4 Failure analysis</w:t>
+        <w:t xml:space="preserve">4) Failure analysis</w:t>
       </w:r>
     </w:p>
     <w:p>
@@ -14191,24 +14161,24 @@
         <w:t xml:space="preserve">KID from the final checkpoint.</w:t>
       </w:r>
     </w:p>
+    <w:bookmarkEnd w:id="45"/>
     <w:bookmarkEnd w:id="46"/>
-    <w:bookmarkEnd w:id="47"/>
-    <w:bookmarkStart w:id="52" w:name="yashashree-shinde-task-3"/>
+    <w:bookmarkStart w:id="51" w:name="c.-member-2-yashashree-shinde-2"/>
     <w:p>
       <w:pPr>
         <w:pStyle w:val="Heading2"/>
       </w:pPr>
       <w:r>
-        <w:t xml:space="preserve">3.3 Yashashree Shinde, Task 3</w:t>
-      </w:r>
-    </w:p>
-    <w:bookmarkStart w:id="48" w:name="architecture-3"/>
+        <w:t xml:space="preserve">C. Member 2: Yashashree Shinde</w:t>
+      </w:r>
+    </w:p>
+    <w:bookmarkStart w:id="47" w:name="architecture-3"/>
     <w:p>
       <w:pPr>
         <w:pStyle w:val="Heading3"/>
       </w:pPr>
       <w:r>
-        <w:t xml:space="preserve">3.3.1 Architecture</w:t>
+        <w:t xml:space="preserve">1) Architecture</w:t>
       </w:r>
     </w:p>
     <w:tbl>
@@ -14543,14 +14513,14 @@
         <w:t xml:space="preserve">The remaining components match the reference implementation.</w:t>
       </w:r>
     </w:p>
-    <w:bookmarkEnd w:id="48"/>
-    <w:bookmarkStart w:id="49" w:name="hyperparameters-1"/>
+    <w:bookmarkEnd w:id="47"/>
+    <w:bookmarkStart w:id="48" w:name="hyperparameters-1"/>
     <w:p>
       <w:pPr>
         <w:pStyle w:val="Heading3"/>
       </w:pPr>
       <w:r>
-        <w:t xml:space="preserve">3.3.2 Hyperparameters</w:t>
+        <w:t xml:space="preserve">2) Hyperparameters</w:t>
       </w:r>
     </w:p>
     <w:tbl>
@@ -14866,14 +14836,14 @@
         <w:t xml:space="preserve">paper adds it for the painting task.</w:t>
       </w:r>
     </w:p>
-    <w:bookmarkEnd w:id="49"/>
-    <w:bookmarkStart w:id="50" w:name="results-5"/>
+    <w:bookmarkEnd w:id="48"/>
+    <w:bookmarkStart w:id="49" w:name="results-5"/>
     <w:p>
       <w:pPr>
         <w:pStyle w:val="Heading3"/>
       </w:pPr>
       <w:r>
-        <w:t xml:space="preserve">3.3.3 Results</w:t>
+        <w:t xml:space="preserve">3) Results</w:t>
       </w:r>
     </w:p>
     <w:tbl>
@@ -15942,14 +15912,14 @@
         <w:t xml:space="preserve">Submitted FID 108.9811, MiFID 0.4171</w:t>
       </w:r>
     </w:p>
-    <w:bookmarkEnd w:id="50"/>
-    <w:bookmarkStart w:id="51" w:name="failure-analysis-3"/>
+    <w:bookmarkEnd w:id="49"/>
+    <w:bookmarkStart w:id="50" w:name="failure-analysis-3"/>
     <w:p>
       <w:pPr>
         <w:pStyle w:val="Heading3"/>
       </w:pPr>
       <w:r>
-        <w:t xml:space="preserve">3.3.4 Failure analysis</w:t>
+        <w:t xml:space="preserve">4) Failure analysis</w:t>
       </w:r>
     </w:p>
     <w:p>
@@ -16581,15 +16551,15 @@
         <w:t xml:space="preserve">from 7.72 to 3.55, for the same reason given in her teammate’s section.</w:t>
       </w:r>
     </w:p>
+    <w:bookmarkEnd w:id="50"/>
     <w:bookmarkEnd w:id="51"/>
-    <w:bookmarkEnd w:id="52"/>
-    <w:bookmarkStart w:id="53" w:name="task-3-comparison-table"/>
+    <w:bookmarkStart w:id="52" w:name="d.-side-by-side-comparison-2"/>
     <w:p>
       <w:pPr>
         <w:pStyle w:val="Heading2"/>
       </w:pPr>
       <w:r>
-        <w:t xml:space="preserve">3.4 Task 3 comparison table</w:t>
+        <w:t xml:space="preserve">D. Side by Side Comparison</w:t>
       </w:r>
     </w:p>
     <w:tbl>
@@ -17957,14 +17927,14 @@
         <w:t xml:space="preserve">differently. Only the scorer’s version is comparable across the class.</w:t>
       </w:r>
     </w:p>
-    <w:bookmarkEnd w:id="53"/>
-    <w:bookmarkStart w:id="54" w:name="task-3-joint-analysis"/>
+    <w:bookmarkEnd w:id="52"/>
+    <w:bookmarkStart w:id="53" w:name="e.-joint-analysis-2"/>
     <w:p>
       <w:pPr>
         <w:pStyle w:val="Heading2"/>
       </w:pPr>
       <w:r>
-        <w:t xml:space="preserve">3.5 Task 3 joint analysis</w:t>
+        <w:t xml:space="preserve">E. Joint Analysis</w:t>
       </w:r>
     </w:p>
     <w:p>
@@ -18441,22 +18411,15 @@
         <w:t xml:space="preserve">coverage become reliable.</w:t>
       </w:r>
     </w:p>
-    <w:p>
-      <w:r>
-        <w:pict>
-          <v:rect style="width:0;height:1.5pt" o:hralign="center" o:hrstd="t" o:hr="t"/>
-        </w:pict>
-      </w:r>
-    </w:p>
+    <w:bookmarkEnd w:id="53"/>
     <w:bookmarkEnd w:id="54"/>
-    <w:bookmarkEnd w:id="55"/>
-    <w:bookmarkStart w:id="56" w:name="part-4.-evidence-trail"/>
+    <w:bookmarkStart w:id="55" w:name="iv.-evidence-trail"/>
     <w:p>
       <w:pPr>
         <w:pStyle w:val="Heading1"/>
       </w:pPr>
       <w:r>
-        <w:t xml:space="preserve">Part 4. Evidence trail</w:t>
+        <w:t xml:space="preserve">IV. EVIDENCE TRAIL</w:t>
       </w:r>
     </w:p>
     <w:p>
@@ -19054,14 +19017,14 @@
         <w:t xml:space="preserve">that catches it are in the notebook, and the failed log is kept as evidence.</w:t>
       </w:r>
     </w:p>
-    <w:bookmarkEnd w:id="56"/>
-    <w:bookmarkStart w:id="57" w:name="part-5.-known-gaps"/>
+    <w:bookmarkEnd w:id="55"/>
+    <w:bookmarkStart w:id="56" w:name="v.-known-gaps"/>
     <w:p>
       <w:pPr>
         <w:pStyle w:val="Heading1"/>
       </w:pPr>
       <w:r>
-        <w:t xml:space="preserve">Part 5. Known gaps</w:t>
+        <w:t xml:space="preserve">V. KNOWN GAPS</w:t>
       </w:r>
     </w:p>
     <w:p>
@@ -19264,26 +19227,571 @@
         <w:t xml:space="preserve">for a proper attribution, because it did not fit the booked GPU time.</w:t>
       </w:r>
     </w:p>
+    <w:bookmarkEnd w:id="56"/>
+    <w:bookmarkStart w:id="57" w:name="contents"/>
+    <w:p>
+      <w:pPr>
+        <w:pStyle w:val="Heading1"/>
+      </w:pPr>
+      <w:r>
+        <w:t xml:space="preserve">CONTENTS</w:t>
+      </w:r>
+    </w:p>
+    <w:tbl>
+      <w:tblPr>
+        <w:tblStyle w:val="Table"/>
+        <w:tblW w:type="auto" w:w="0"/>
+        <w:tblLook w:firstRow="1" w:lastRow="0" w:firstColumn="0" w:lastColumn="0" w:noHBand="0" w:noVBand="0" w:val="0020"/>
+      </w:tblPr>
+      <w:tblGrid>
+        <w:gridCol w:w="3960"/>
+        <w:gridCol w:w="3960"/>
+      </w:tblGrid>
+      <w:tr>
+        <w:trPr>
+          <w:tblHeader w:val="on"/>
+        </w:trPr>
+        <w:tc>
+          <w:tcPr/>
+          <w:p>
+            <w:pPr>
+              <w:pStyle w:val="Compact"/>
+            </w:pPr>
+            <w:r>
+              <w:t xml:space="preserve">Section</w:t>
+            </w:r>
+          </w:p>
+        </w:tc>
+        <w:tc>
+          <w:tcPr/>
+          <w:p>
+            <w:pPr>
+              <w:pStyle w:val="Compact"/>
+            </w:pPr>
+            <w:r>
+              <w:t xml:space="preserve">Title</w:t>
+            </w:r>
+          </w:p>
+        </w:tc>
+      </w:tr>
+      <w:tr>
+        <w:tc>
+          <w:tcPr/>
+          <w:p>
+            <w:pPr>
+              <w:pStyle w:val="Compact"/>
+            </w:pPr>
+            <w:r>
+              <w:t xml:space="preserve">I</w:t>
+            </w:r>
+          </w:p>
+        </w:tc>
+        <w:tc>
+          <w:tcPr/>
+          <w:p>
+            <w:pPr>
+              <w:pStyle w:val="Compact"/>
+            </w:pPr>
+            <w:r>
+              <w:t xml:space="preserve">Task 1: Character Level Language Model</w:t>
+            </w:r>
+          </w:p>
+        </w:tc>
+      </w:tr>
+      <w:tr>
+        <w:tc>
+          <w:tcPr/>
+          <w:p>
+            <w:pPr>
+              <w:pStyle w:val="Compact"/>
+            </w:pPr>
+            <w:r>
+              <w:t xml:space="preserve">I.A</w:t>
+            </w:r>
+          </w:p>
+        </w:tc>
+        <w:tc>
+          <w:tcPr/>
+          <w:p>
+            <w:pPr>
+              <w:pStyle w:val="Compact"/>
+            </w:pPr>
+            <w:r>
+              <w:t xml:space="preserve">Objective</w:t>
+            </w:r>
+          </w:p>
+        </w:tc>
+      </w:tr>
+      <w:tr>
+        <w:tc>
+          <w:tcPr/>
+          <w:p>
+            <w:pPr>
+              <w:pStyle w:val="Compact"/>
+            </w:pPr>
+            <w:r>
+              <w:t xml:space="preserve">I.B</w:t>
+            </w:r>
+          </w:p>
+        </w:tc>
+        <w:tc>
+          <w:tcPr/>
+          <w:p>
+            <w:pPr>
+              <w:pStyle w:val="Compact"/>
+            </w:pPr>
+            <w:r>
+              <w:t xml:space="preserve">Member 1: Anees Saheba Guddi</w:t>
+            </w:r>
+          </w:p>
+        </w:tc>
+      </w:tr>
+      <w:tr>
+        <w:tc>
+          <w:tcPr/>
+          <w:p>
+            <w:pPr>
+              <w:pStyle w:val="Compact"/>
+            </w:pPr>
+            <w:r>
+              <w:t xml:space="preserve">I.C</w:t>
+            </w:r>
+          </w:p>
+        </w:tc>
+        <w:tc>
+          <w:tcPr/>
+          <w:p>
+            <w:pPr>
+              <w:pStyle w:val="Compact"/>
+            </w:pPr>
+            <w:r>
+              <w:t xml:space="preserve">Member 2: Yashashree Shinde</w:t>
+            </w:r>
+          </w:p>
+        </w:tc>
+      </w:tr>
+      <w:tr>
+        <w:tc>
+          <w:tcPr/>
+          <w:p>
+            <w:pPr>
+              <w:pStyle w:val="Compact"/>
+            </w:pPr>
+            <w:r>
+              <w:t xml:space="preserve">I.D</w:t>
+            </w:r>
+          </w:p>
+        </w:tc>
+        <w:tc>
+          <w:tcPr/>
+          <w:p>
+            <w:pPr>
+              <w:pStyle w:val="Compact"/>
+            </w:pPr>
+            <w:r>
+              <w:t xml:space="preserve">Side by Side Comparison</w:t>
+            </w:r>
+          </w:p>
+        </w:tc>
+      </w:tr>
+      <w:tr>
+        <w:tc>
+          <w:tcPr/>
+          <w:p>
+            <w:pPr>
+              <w:pStyle w:val="Compact"/>
+            </w:pPr>
+            <w:r>
+              <w:t xml:space="preserve">I.E</w:t>
+            </w:r>
+          </w:p>
+        </w:tc>
+        <w:tc>
+          <w:tcPr/>
+          <w:p>
+            <w:pPr>
+              <w:pStyle w:val="Compact"/>
+            </w:pPr>
+            <w:r>
+              <w:t xml:space="preserve">Joint Analysis</w:t>
+            </w:r>
+          </w:p>
+        </w:tc>
+      </w:tr>
+      <w:tr>
+        <w:tc>
+          <w:tcPr/>
+          <w:p>
+            <w:pPr>
+              <w:pStyle w:val="Compact"/>
+            </w:pPr>
+            <w:r>
+              <w:t xml:space="preserve">II</w:t>
+            </w:r>
+          </w:p>
+        </w:tc>
+        <w:tc>
+          <w:tcPr/>
+          <w:p>
+            <w:pPr>
+              <w:pStyle w:val="Compact"/>
+            </w:pPr>
+            <w:r>
+              <w:t xml:space="preserve">Task 2: Yelp Polarity Sentiment Classification</w:t>
+            </w:r>
+          </w:p>
+        </w:tc>
+      </w:tr>
+      <w:tr>
+        <w:tc>
+          <w:tcPr/>
+          <w:p>
+            <w:pPr>
+              <w:pStyle w:val="Compact"/>
+            </w:pPr>
+            <w:r>
+              <w:t xml:space="preserve">II.A</w:t>
+            </w:r>
+          </w:p>
+        </w:tc>
+        <w:tc>
+          <w:tcPr/>
+          <w:p>
+            <w:pPr>
+              <w:pStyle w:val="Compact"/>
+            </w:pPr>
+            <w:r>
+              <w:t xml:space="preserve">Objective</w:t>
+            </w:r>
+          </w:p>
+        </w:tc>
+      </w:tr>
+      <w:tr>
+        <w:tc>
+          <w:tcPr/>
+          <w:p>
+            <w:pPr>
+              <w:pStyle w:val="Compact"/>
+            </w:pPr>
+            <w:r>
+              <w:t xml:space="preserve">II.B</w:t>
+            </w:r>
+          </w:p>
+        </w:tc>
+        <w:tc>
+          <w:tcPr/>
+          <w:p>
+            <w:pPr>
+              <w:pStyle w:val="Compact"/>
+            </w:pPr>
+            <w:r>
+              <w:t xml:space="preserve">Member 1: Anees Saheba Guddi</w:t>
+            </w:r>
+          </w:p>
+        </w:tc>
+      </w:tr>
+      <w:tr>
+        <w:tc>
+          <w:tcPr/>
+          <w:p>
+            <w:pPr>
+              <w:pStyle w:val="Compact"/>
+            </w:pPr>
+            <w:r>
+              <w:t xml:space="preserve">II.C</w:t>
+            </w:r>
+          </w:p>
+        </w:tc>
+        <w:tc>
+          <w:tcPr/>
+          <w:p>
+            <w:pPr>
+              <w:pStyle w:val="Compact"/>
+            </w:pPr>
+            <w:r>
+              <w:t xml:space="preserve">Member 2: Yashashree Shinde</w:t>
+            </w:r>
+          </w:p>
+        </w:tc>
+      </w:tr>
+      <w:tr>
+        <w:tc>
+          <w:tcPr/>
+          <w:p>
+            <w:pPr>
+              <w:pStyle w:val="Compact"/>
+            </w:pPr>
+            <w:r>
+              <w:t xml:space="preserve">II.D</w:t>
+            </w:r>
+          </w:p>
+        </w:tc>
+        <w:tc>
+          <w:tcPr/>
+          <w:p>
+            <w:pPr>
+              <w:pStyle w:val="Compact"/>
+            </w:pPr>
+            <w:r>
+              <w:t xml:space="preserve">Side by Side Comparison</w:t>
+            </w:r>
+          </w:p>
+        </w:tc>
+      </w:tr>
+      <w:tr>
+        <w:tc>
+          <w:tcPr/>
+          <w:p>
+            <w:pPr>
+              <w:pStyle w:val="Compact"/>
+            </w:pPr>
+            <w:r>
+              <w:t xml:space="preserve">II.E</w:t>
+            </w:r>
+          </w:p>
+        </w:tc>
+        <w:tc>
+          <w:tcPr/>
+          <w:p>
+            <w:pPr>
+              <w:pStyle w:val="Compact"/>
+            </w:pPr>
+            <w:r>
+              <w:t xml:space="preserve">Joint Analysis</w:t>
+            </w:r>
+          </w:p>
+        </w:tc>
+      </w:tr>
+      <w:tr>
+        <w:tc>
+          <w:tcPr/>
+          <w:p>
+            <w:pPr>
+              <w:pStyle w:val="Compact"/>
+            </w:pPr>
+            <w:r>
+              <w:t xml:space="preserve">III</w:t>
+            </w:r>
+          </w:p>
+        </w:tc>
+        <w:tc>
+          <w:tcPr/>
+          <w:p>
+            <w:pPr>
+              <w:pStyle w:val="Compact"/>
+            </w:pPr>
+            <w:r>
+              <w:t xml:space="preserve">Task 3: CycleGAN Monet and Photo Style Transfer</w:t>
+            </w:r>
+          </w:p>
+        </w:tc>
+      </w:tr>
+      <w:tr>
+        <w:tc>
+          <w:tcPr/>
+          <w:p>
+            <w:pPr>
+              <w:pStyle w:val="Compact"/>
+            </w:pPr>
+            <w:r>
+              <w:t xml:space="preserve">III.A</w:t>
+            </w:r>
+          </w:p>
+        </w:tc>
+        <w:tc>
+          <w:tcPr/>
+          <w:p>
+            <w:pPr>
+              <w:pStyle w:val="Compact"/>
+            </w:pPr>
+            <w:r>
+              <w:t xml:space="preserve">Objective</w:t>
+            </w:r>
+          </w:p>
+        </w:tc>
+      </w:tr>
+      <w:tr>
+        <w:tc>
+          <w:tcPr/>
+          <w:p>
+            <w:pPr>
+              <w:pStyle w:val="Compact"/>
+            </w:pPr>
+            <w:r>
+              <w:t xml:space="preserve">III.B</w:t>
+            </w:r>
+          </w:p>
+        </w:tc>
+        <w:tc>
+          <w:tcPr/>
+          <w:p>
+            <w:pPr>
+              <w:pStyle w:val="Compact"/>
+            </w:pPr>
+            <w:r>
+              <w:t xml:space="preserve">Member 1: Anees Saheba Guddi</w:t>
+            </w:r>
+          </w:p>
+        </w:tc>
+      </w:tr>
+      <w:tr>
+        <w:tc>
+          <w:tcPr/>
+          <w:p>
+            <w:pPr>
+              <w:pStyle w:val="Compact"/>
+            </w:pPr>
+            <w:r>
+              <w:t xml:space="preserve">III.C</w:t>
+            </w:r>
+          </w:p>
+        </w:tc>
+        <w:tc>
+          <w:tcPr/>
+          <w:p>
+            <w:pPr>
+              <w:pStyle w:val="Compact"/>
+            </w:pPr>
+            <w:r>
+              <w:t xml:space="preserve">Member 2: Yashashree Shinde</w:t>
+            </w:r>
+          </w:p>
+        </w:tc>
+      </w:tr>
+      <w:tr>
+        <w:tc>
+          <w:tcPr/>
+          <w:p>
+            <w:pPr>
+              <w:pStyle w:val="Compact"/>
+            </w:pPr>
+            <w:r>
+              <w:t xml:space="preserve">III.D</w:t>
+            </w:r>
+          </w:p>
+        </w:tc>
+        <w:tc>
+          <w:tcPr/>
+          <w:p>
+            <w:pPr>
+              <w:pStyle w:val="Compact"/>
+            </w:pPr>
+            <w:r>
+              <w:t xml:space="preserve">Side by Side Comparison</w:t>
+            </w:r>
+          </w:p>
+        </w:tc>
+      </w:tr>
+      <w:tr>
+        <w:tc>
+          <w:tcPr/>
+          <w:p>
+            <w:pPr>
+              <w:pStyle w:val="Compact"/>
+            </w:pPr>
+            <w:r>
+              <w:t xml:space="preserve">III.E</w:t>
+            </w:r>
+          </w:p>
+        </w:tc>
+        <w:tc>
+          <w:tcPr/>
+          <w:p>
+            <w:pPr>
+              <w:pStyle w:val="Compact"/>
+            </w:pPr>
+            <w:r>
+              <w:t xml:space="preserve">Joint Analysis</w:t>
+            </w:r>
+          </w:p>
+        </w:tc>
+      </w:tr>
+      <w:tr>
+        <w:tc>
+          <w:tcPr/>
+          <w:p>
+            <w:pPr>
+              <w:pStyle w:val="Compact"/>
+            </w:pPr>
+            <w:r>
+              <w:t xml:space="preserve">IV</w:t>
+            </w:r>
+          </w:p>
+        </w:tc>
+        <w:tc>
+          <w:tcPr/>
+          <w:p>
+            <w:pPr>
+              <w:pStyle w:val="Compact"/>
+            </w:pPr>
+            <w:r>
+              <w:t xml:space="preserve">Evidence Trail</w:t>
+            </w:r>
+          </w:p>
+        </w:tc>
+      </w:tr>
+      <w:tr>
+        <w:tc>
+          <w:tcPr/>
+          <w:p>
+            <w:pPr>
+              <w:pStyle w:val="Compact"/>
+            </w:pPr>
+            <w:r>
+              <w:t xml:space="preserve">V</w:t>
+            </w:r>
+          </w:p>
+        </w:tc>
+        <w:tc>
+          <w:tcPr/>
+          <w:p>
+            <w:pPr>
+              <w:pStyle w:val="Compact"/>
+            </w:pPr>
+            <w:r>
+              <w:t xml:space="preserve">Known Gaps</w:t>
+            </w:r>
+          </w:p>
+        </w:tc>
+      </w:tr>
+      <w:tr>
+        <w:tc>
+          <w:tcPr/>
+          <w:p>
+            <w:pPr>
+              <w:pStyle w:val="Compact"/>
+            </w:pPr>
+          </w:p>
+        </w:tc>
+        <w:tc>
+          <w:tcPr/>
+          <w:p>
+            <w:pPr>
+              <w:pStyle w:val="Compact"/>
+            </w:pPr>
+            <w:r>
+              <w:t xml:space="preserve">References</w:t>
+            </w:r>
+          </w:p>
+        </w:tc>
+      </w:tr>
+    </w:tbl>
     <w:bookmarkEnd w:id="57"/>
-    <w:bookmarkStart w:id="58" w:name="part-6.-references"/>
+    <w:bookmarkStart w:id="58" w:name="references"/>
     <w:p>
       <w:pPr>
         <w:pStyle w:val="Heading1"/>
       </w:pPr>
       <w:r>
-        <w:t xml:space="preserve">Part 6. References</w:t>
-      </w:r>
-    </w:p>
-    <w:p>
-      <w:pPr>
-        <w:pStyle w:val="Compact"/>
-        <w:numPr>
-          <w:ilvl w:val="0"/>
-          <w:numId w:val="1057"/>
-        </w:numPr>
-      </w:pPr>
-      <w:r>
-        <w:t xml:space="preserve">Vaswani, A., Shazeer, N., Parmar, N., Uszkoreit, J., Jones, L., Gomez,</w:t>
+        <w:t xml:space="preserve">REFERENCES</w:t>
+      </w:r>
+    </w:p>
+    <w:p>
+      <w:pPr>
+        <w:pStyle w:val="FirstParagraph"/>
+      </w:pPr>
+      <w:r>
+        <w:t xml:space="preserve">[1] Vaswani, A., Shazeer, N., Parmar, N., Uszkoreit, J., Jones, L., Gomez,</w:t>
       </w:r>
       <w:r>
         <w:t xml:space="preserve"> </w:t>
@@ -19297,17 +19805,11 @@
       <w:r>
         <w:t xml:space="preserve">Advances in Neural Information Processing Systems 30.</w:t>
       </w:r>
-    </w:p>
-    <w:p>
-      <w:pPr>
-        <w:pStyle w:val="Compact"/>
-        <w:numPr>
-          <w:ilvl w:val="0"/>
-          <w:numId w:val="1057"/>
-        </w:numPr>
-      </w:pPr>
-      <w:r>
-        <w:t xml:space="preserve">Eldan, R. and Li, Y. (2023). TinyStories: How Small Can Language Models Be</w:t>
+      <w:r>
+        <w:t xml:space="preserve"> </w:t>
+      </w:r>
+      <w:r>
+        <w:t xml:space="preserve">[2] Eldan, R. and Li, Y. (2023). TinyStories: How Small Can Language Models Be</w:t>
       </w:r>
       <w:r>
         <w:t xml:space="preserve"> </w:t>
@@ -19315,17 +19817,11 @@
       <w:r>
         <w:t xml:space="preserve">and Still Speak Coherent English? arXiv:2305.07759.</w:t>
       </w:r>
-    </w:p>
-    <w:p>
-      <w:pPr>
-        <w:pStyle w:val="Compact"/>
-        <w:numPr>
-          <w:ilvl w:val="0"/>
-          <w:numId w:val="1057"/>
-        </w:numPr>
-      </w:pPr>
-      <w:r>
-        <w:t xml:space="preserve">Zhu, J.-Y., Park, T., Isola, P. and Efros, A. A. (2017). Unpaired Image to</w:t>
+      <w:r>
+        <w:t xml:space="preserve"> </w:t>
+      </w:r>
+      <w:r>
+        <w:t xml:space="preserve">[3] Zhu, J.-Y., Park, T., Isola, P. and Efros, A. A. (2017). Unpaired Image to</w:t>
       </w:r>
       <w:r>
         <w:t xml:space="preserve"> </w:t>
@@ -19339,17 +19835,11 @@
       <w:r>
         <w:t xml:space="preserve">International Conference on Computer Vision.</w:t>
       </w:r>
-    </w:p>
-    <w:p>
-      <w:pPr>
-        <w:pStyle w:val="Compact"/>
-        <w:numPr>
-          <w:ilvl w:val="0"/>
-          <w:numId w:val="1057"/>
-        </w:numPr>
-      </w:pPr>
-      <w:r>
-        <w:t xml:space="preserve">Naeem, M. F., Oh, S. J., Uh, Y., Choi, Y. and Yoo, J. (2020). Reliable</w:t>
+      <w:r>
+        <w:t xml:space="preserve"> </w:t>
+      </w:r>
+      <w:r>
+        <w:t xml:space="preserve">[4] Naeem, M. F., Oh, S. J., Uh, Y., Choi, Y. and Yoo, J. (2020). Reliable</w:t>
       </w:r>
       <w:r>
         <w:t xml:space="preserve"> </w:t>
@@ -19582,91 +20072,6 @@
       <w:rPr>
         <w:rFonts w:ascii="Wingdings" w:hAnsi="Wingdings" w:cs="Wingdings" w:hint="default"/>
       </w:rPr>
-    </w:lvl>
-  </w:abstractNum>
-  <w:abstractNum w:abstractNumId="99411">
-    <w:nsid w:val="00A99411"/>
-    <w:multiLevelType w:val="multilevel"/>
-    <w:lvl w:ilvl="0">
-      <w:start w:val="1"/>
-      <w:numFmt w:val="decimal"/>
-      <w:lvlText w:val="%1."/>
-      <w:lvlJc w:val="left"/>
-      <w:pPr>
-        <w:ind w:left="720" w:hanging="360"/>
-      </w:pPr>
-    </w:lvl>
-    <w:lvl w:ilvl="1">
-      <w:start w:val="1"/>
-      <w:numFmt w:val="decimal"/>
-      <w:lvlText w:val="%2."/>
-      <w:lvlJc w:val="left"/>
-      <w:pPr>
-        <w:ind w:left="1440" w:hanging="360"/>
-      </w:pPr>
-    </w:lvl>
-    <w:lvl w:ilvl="2">
-      <w:start w:val="1"/>
-      <w:numFmt w:val="decimal"/>
-      <w:lvlText w:val="%3."/>
-      <w:lvlJc w:val="left"/>
-      <w:pPr>
-        <w:ind w:left="2160" w:hanging="360"/>
-      </w:pPr>
-    </w:lvl>
-    <w:lvl w:ilvl="3">
-      <w:start w:val="1"/>
-      <w:numFmt w:val="decimal"/>
-      <w:lvlText w:val="%4."/>
-      <w:lvlJc w:val="left"/>
-      <w:pPr>
-        <w:ind w:left="2880" w:hanging="360"/>
-      </w:pPr>
-    </w:lvl>
-    <w:lvl w:ilvl="4">
-      <w:start w:val="1"/>
-      <w:numFmt w:val="decimal"/>
-      <w:lvlText w:val="%5."/>
-      <w:lvlJc w:val="left"/>
-      <w:pPr>
-        <w:ind w:left="3600" w:hanging="360"/>
-      </w:pPr>
-    </w:lvl>
-    <w:lvl w:ilvl="5">
-      <w:start w:val="1"/>
-      <w:numFmt w:val="decimal"/>
-      <w:lvlText w:val="%6."/>
-      <w:lvlJc w:val="left"/>
-      <w:pPr>
-        <w:ind w:left="4320" w:hanging="360"/>
-      </w:pPr>
-    </w:lvl>
-    <w:lvl w:ilvl="6">
-      <w:start w:val="1"/>
-      <w:numFmt w:val="decimal"/>
-      <w:lvlText w:val="%7."/>
-      <w:lvlJc w:val="left"/>
-      <w:pPr>
-        <w:ind w:left="5040" w:hanging="360"/>
-      </w:pPr>
-    </w:lvl>
-    <w:lvl w:ilvl="7">
-      <w:start w:val="1"/>
-      <w:numFmt w:val="decimal"/>
-      <w:lvlText w:val="%8."/>
-      <w:lvlJc w:val="left"/>
-      <w:pPr>
-        <w:ind w:left="5760" w:hanging="360"/>
-      </w:pPr>
-    </w:lvl>
-    <w:lvl w:ilvl="8">
-      <w:start w:val="1"/>
-      <w:numFmt w:val="decimal"/>
-      <w:lvlText w:val="%9."/>
-      <w:lvlJc w:val="left"/>
-      <w:pPr>
-        <w:ind w:left="6480" w:hanging="360"/>
-      </w:pPr>
     </w:lvl>
   </w:abstractNum>
   <w:num w:numId="1000">
@@ -19839,36 +20244,6 @@
   </w:num>
   <w:num w:numId="1056">
     <w:abstractNumId w:val="991"/>
-  </w:num>
-  <w:num w:numId="1057">
-    <w:abstractNumId w:val="99411"/>
-    <w:lvlOverride w:ilvl="0">
-      <w:startOverride w:val="1"/>
-    </w:lvlOverride>
-    <w:lvlOverride w:ilvl="1">
-      <w:startOverride w:val="1"/>
-    </w:lvlOverride>
-    <w:lvlOverride w:ilvl="2">
-      <w:startOverride w:val="1"/>
-    </w:lvlOverride>
-    <w:lvlOverride w:ilvl="3">
-      <w:startOverride w:val="1"/>
-    </w:lvlOverride>
-    <w:lvlOverride w:ilvl="4">
-      <w:startOverride w:val="1"/>
-    </w:lvlOverride>
-    <w:lvlOverride w:ilvl="5">
-      <w:startOverride w:val="1"/>
-    </w:lvlOverride>
-    <w:lvlOverride w:ilvl="6">
-      <w:startOverride w:val="1"/>
-    </w:lvlOverride>
-    <w:lvlOverride w:ilvl="7">
-      <w:startOverride w:val="1"/>
-    </w:lvlOverride>
-    <w:lvlOverride w:ilvl="8">
-      <w:startOverride w:val="1"/>
-    </w:lvlOverride>
   </w:num>
 </w:numbering>
 </file>

</xml_diff>

<commit_message>
Use full SJSU ids, switch to single column, add eleven figures
Replaces the four digit identifiers with the full SJSU ids, 018205330 and
019134349.

Switches the layout from two columns to one, which gives the tables and the
figures room to be read at full width. The repository link in the title
block is now a blue underlined link.

Adds eleven figures with IEEE captions, all generated by the submitted
notebooks: both members' Task 1 loss curves, the Yelp class balance, the
ROC, precision recall and calibration panel, the confusion matrices, both
members' CycleGAN training curves, and four comparison strips built from the
committed validation images showing the same photograph translated by both
models, both cycle reconstructions, and the artifacts in flat regions.

The comparison strips make the identity weight argument visible rather than
only measurable.
</commit_message>
<xml_diff>
--- a/report/DATA266_Lab1_Report_Team_8.docx
+++ b/report/DATA266_Lab1_Report_Team_8.docx
@@ -24,7 +24,7 @@
         <w:pStyle w:val="FirstParagraph"/>
       </w:pPr>
       <w:r>
-        <w:t xml:space="preserve">Anees Saheba Guddi (SID4 5330) and Yashashree Shinde (SID4 4349)</w:t>
+        <w:t xml:space="preserve">Anees Saheba Guddi (SJSU ID 018205330) and Yashashree Shinde (SJSU ID 019134349)</w:t>
       </w:r>
     </w:p>
     <w:p>
@@ -304,7 +304,7 @@
       </w:r>
     </w:p>
     <w:bookmarkEnd w:id="10"/>
-    <w:bookmarkStart w:id="26" w:name="i.-task-1-character-level-language-model"/>
+    <w:bookmarkStart w:id="32" w:name="i.-task-1-character-level-language-model"/>
     <w:p>
       <w:pPr>
         <w:pStyle w:val="Heading1"/>
@@ -369,7 +369,7 @@
       </w:r>
     </w:p>
     <w:bookmarkEnd w:id="11"/>
-    <w:bookmarkStart w:id="17" w:name="b.-member-1-anees-saheba-guddi"/>
+    <w:bookmarkStart w:id="20" w:name="b.-member-1-anees-saheba-guddi"/>
     <w:p>
       <w:pPr>
         <w:pStyle w:val="Heading2"/>
@@ -1014,13 +1014,68 @@
       </w:r>
     </w:p>
     <w:bookmarkEnd w:id="14"/>
-    <w:bookmarkStart w:id="15" w:name="results"/>
+    <w:bookmarkStart w:id="18" w:name="results"/>
     <w:p>
       <w:pPr>
         <w:pStyle w:val="Heading3"/>
       </w:pPr>
       <w:r>
         <w:t xml:space="preserve">4) Results</w:t>
+      </w:r>
+    </w:p>
+    <w:p>
+      <w:pPr>
+        <w:pStyle w:val="CaptionedFigure"/>
+      </w:pPr>
+      <w:r>
+        <w:drawing>
+          <wp:inline>
+            <wp:extent cx="5334000" cy="3692769"/>
+            <wp:effectExtent b="0" l="0" r="0" t="0"/>
+            <wp:docPr descr="Fig. 1. Training and validation loss curves over ten epochs, Anees. Validation loss sits at or below training loss throughout, giving a generalisation gap of -0.0303." title="" id="16" name="Picture"/>
+            <a:graphic>
+              <a:graphicData uri="http://schemas.openxmlformats.org/drawingml/2006/picture">
+                <pic:pic>
+                  <pic:nvPicPr>
+                    <pic:cNvPr descr="figures/fig1_t1_anees_loss.png" id="17" name="Picture"/>
+                    <pic:cNvPicPr>
+                      <a:picLocks noChangeArrowheads="1" noChangeAspect="1"/>
+                    </pic:cNvPicPr>
+                  </pic:nvPicPr>
+                  <pic:blipFill>
+                    <a:blip r:embed="rId15"/>
+                    <a:stretch>
+                      <a:fillRect/>
+                    </a:stretch>
+                  </pic:blipFill>
+                  <pic:spPr bwMode="auto">
+                    <a:xfrm>
+                      <a:off x="0" y="0"/>
+                      <a:ext cx="5334000" cy="3692769"/>
+                    </a:xfrm>
+                    <a:prstGeom prst="rect">
+                      <a:avLst/>
+                    </a:prstGeom>
+                    <a:noFill/>
+                    <a:ln w="9525">
+                      <a:noFill/>
+                      <a:headEnd/>
+                      <a:tailEnd/>
+                    </a:ln>
+                  </pic:spPr>
+                </pic:pic>
+              </a:graphicData>
+            </a:graphic>
+          </wp:inline>
+        </w:drawing>
+      </w:r>
+    </w:p>
+    <w:p>
+      <w:pPr>
+        <w:pStyle w:val="ImageCaption"/>
+      </w:pPr>
+      <w:r>
+        <w:t xml:space="preserve">Fig. 1. Training and validation loss curves over ten epochs, Anees. Validation loss sits at or below training loss throughout, giving a generalisation gap of -0.0303.</w:t>
       </w:r>
     </w:p>
     <w:tbl>
@@ -1833,8 +1888,8 @@
         </w:tc>
       </w:tr>
     </w:tbl>
-    <w:bookmarkEnd w:id="15"/>
-    <w:bookmarkStart w:id="16" w:name="failure-analysis"/>
+    <w:bookmarkEnd w:id="18"/>
+    <w:bookmarkStart w:id="19" w:name="failure-analysis"/>
     <w:p>
       <w:pPr>
         <w:pStyle w:val="Heading3"/>
@@ -2281,9 +2336,9 @@
         <w:t xml:space="preserve">first change he would test.</w:t>
       </w:r>
     </w:p>
-    <w:bookmarkEnd w:id="16"/>
-    <w:bookmarkEnd w:id="17"/>
-    <w:bookmarkStart w:id="23" w:name="c.-member-2-yashashree-shinde"/>
+    <w:bookmarkEnd w:id="19"/>
+    <w:bookmarkEnd w:id="20"/>
+    <w:bookmarkStart w:id="29" w:name="c.-member-2-yashashree-shinde"/>
     <w:p>
       <w:pPr>
         <w:pStyle w:val="Heading2"/>
@@ -2292,7 +2347,7 @@
         <w:t xml:space="preserve">C. Member 2: Yashashree Shinde</w:t>
       </w:r>
     </w:p>
-    <w:bookmarkStart w:id="18" w:name="architecture-1"/>
+    <w:bookmarkStart w:id="21" w:name="architecture-1"/>
     <w:p>
       <w:pPr>
         <w:pStyle w:val="Heading3"/>
@@ -2627,8 +2682,8 @@
         </w:tc>
       </w:tr>
     </w:tbl>
-    <w:bookmarkEnd w:id="18"/>
-    <w:bookmarkStart w:id="19" w:name="hyperparameters-and-reasons-1"/>
+    <w:bookmarkEnd w:id="21"/>
+    <w:bookmarkStart w:id="22" w:name="hyperparameters-and-reasons-1"/>
     <w:p>
       <w:pPr>
         <w:pStyle w:val="Heading3"/>
@@ -2765,8 +2820,8 @@
         <w:t xml:space="preserve">context length, so that the two runs differ along a meaningful axis.</w:t>
       </w:r>
     </w:p>
-    <w:bookmarkEnd w:id="19"/>
-    <w:bookmarkStart w:id="20" w:name="data-preprocessing-1"/>
+    <w:bookmarkEnd w:id="22"/>
+    <w:bookmarkStart w:id="23" w:name="data-preprocessing-1"/>
     <w:p>
       <w:pPr>
         <w:pStyle w:val="Heading3"/>
@@ -2841,14 +2896,78 @@
         <w:t xml:space="preserve">of 101 includes the corrupted sequences as if they were real characters.</w:t>
       </w:r>
     </w:p>
-    <w:bookmarkEnd w:id="20"/>
-    <w:bookmarkStart w:id="21" w:name="results-1"/>
+    <w:bookmarkEnd w:id="23"/>
+    <w:bookmarkStart w:id="27" w:name="results-1"/>
     <w:p>
       <w:pPr>
         <w:pStyle w:val="Heading3"/>
       </w:pPr>
       <w:r>
         <w:t xml:space="preserve">4) Results</w:t>
+      </w:r>
+    </w:p>
+    <w:p>
+      <w:pPr>
+        <w:pStyle w:val="CaptionedFigure"/>
+      </w:pPr>
+      <w:r>
+        <w:drawing>
+          <wp:inline>
+            <wp:extent cx="5334000" cy="3259666"/>
+            <wp:effectExtent b="0" l="0" r="0" t="0"/>
+            <wp:docPr descr="Fig. 2. Training and validation loss curves over ten epochs, Yashashree. The two curves stay together, giving a generalisation gap of -0.0009." title="" id="25" name="Picture"/>
+            <a:graphic>
+              <a:graphicData uri="http://schemas.openxmlformats.org/drawingml/2006/picture">
+                <pic:pic>
+                  <pic:nvPicPr>
+                    <pic:cNvPr descr="figures/fig2_t1_yash_loss.svg" id="26" name="Picture"/>
+                    <pic:cNvPicPr>
+                      <a:picLocks noChangeArrowheads="1" noChangeAspect="1"/>
+                    </pic:cNvPicPr>
+                  </pic:nvPicPr>
+                  <pic:blipFill>
+                    <a:blip>
+                      <a:extLst>
+                        <a:ext uri="{28A0092B-C50C-407E-A947-70E740481C1C}">
+                          <a14:useLocalDpi xmlns:a14="http://schemas.microsoft.com/office/drawing/2010/main" val="0"/>
+                        </a:ext>
+                        <a:ext uri="{96DAC541-7B7A-43D3-8B79-37D633B846F1}">
+                          <asvg:svgBlip xmlns:asvg="http://schemas.microsoft.com/office/drawing/2016/SVG/main" r:embed="rId24"/>
+                        </a:ext>
+                      </a:extLst>
+                    </a:blip>
+                    <a:stretch>
+                      <a:fillRect/>
+                    </a:stretch>
+                  </pic:blipFill>
+                  <pic:spPr bwMode="auto">
+                    <a:xfrm>
+                      <a:off x="0" y="0"/>
+                      <a:ext cx="5334000" cy="3259666"/>
+                    </a:xfrm>
+                    <a:prstGeom prst="rect">
+                      <a:avLst/>
+                    </a:prstGeom>
+                    <a:noFill/>
+                    <a:ln w="9525">
+                      <a:noFill/>
+                      <a:headEnd/>
+                      <a:tailEnd/>
+                    </a:ln>
+                  </pic:spPr>
+                </pic:pic>
+              </a:graphicData>
+            </a:graphic>
+          </wp:inline>
+        </w:drawing>
+      </w:r>
+    </w:p>
+    <w:p>
+      <w:pPr>
+        <w:pStyle w:val="ImageCaption"/>
+      </w:pPr>
+      <w:r>
+        <w:t xml:space="preserve">Fig. 2. Training and validation loss curves over ten epochs, Yashashree. The two curves stay together, giving a generalisation gap of -0.0009.</w:t>
       </w:r>
     </w:p>
     <w:tbl>
@@ -3463,8 +3582,8 @@
         </w:tc>
       </w:tr>
     </w:tbl>
-    <w:bookmarkEnd w:id="21"/>
-    <w:bookmarkStart w:id="22" w:name="failure-analysis-1"/>
+    <w:bookmarkEnd w:id="27"/>
+    <w:bookmarkStart w:id="28" w:name="failure-analysis-1"/>
     <w:p>
       <w:pPr>
         <w:pStyle w:val="Heading3"/>
@@ -3755,9 +3874,9 @@
         <w:t xml:space="preserve">better context quality, longer training.</w:t>
       </w:r>
     </w:p>
-    <w:bookmarkEnd w:id="22"/>
-    <w:bookmarkEnd w:id="23"/>
-    <w:bookmarkStart w:id="24" w:name="d.-side-by-side-comparison"/>
+    <w:bookmarkEnd w:id="28"/>
+    <w:bookmarkEnd w:id="29"/>
+    <w:bookmarkStart w:id="30" w:name="d.-side-by-side-comparison"/>
     <w:p>
       <w:pPr>
         <w:pStyle w:val="Heading2"/>
@@ -4926,8 +5045,8 @@
         </w:tc>
       </w:tr>
     </w:tbl>
-    <w:bookmarkEnd w:id="24"/>
-    <w:bookmarkStart w:id="25" w:name="e.-joint-analysis"/>
+    <w:bookmarkEnd w:id="30"/>
+    <w:bookmarkStart w:id="31" w:name="e.-joint-analysis"/>
     <w:p>
       <w:pPr>
         <w:pStyle w:val="Heading2"/>
@@ -5326,9 +5445,9 @@
         <w:t xml:space="preserve">Measuring repetition at matched perplexity rather than matched temperature.</w:t>
       </w:r>
     </w:p>
-    <w:bookmarkEnd w:id="25"/>
-    <w:bookmarkEnd w:id="26"/>
-    <w:bookmarkStart w:id="40" w:name="X2cebc2794bdbf50d8772ae559a484a5ed2c0cc9"/>
+    <w:bookmarkEnd w:id="31"/>
+    <w:bookmarkEnd w:id="32"/>
+    <w:bookmarkStart w:id="55" w:name="X2cebc2794bdbf50d8772ae559a484a5ed2c0cc9"/>
     <w:p>
       <w:pPr>
         <w:pStyle w:val="Heading1"/>
@@ -5337,7 +5456,7 @@
         <w:t xml:space="preserve">II. TASK 2: YELP POLARITY SENTIMENT CLASSIFICATION</w:t>
       </w:r>
     </w:p>
-    <w:bookmarkStart w:id="27" w:name="a.-objective-1"/>
+    <w:bookmarkStart w:id="33" w:name="a.-objective-1"/>
     <w:p>
       <w:pPr>
         <w:pStyle w:val="Heading2"/>
@@ -5372,8 +5491,8 @@
         <w:t xml:space="preserve">fixed categories.</w:t>
       </w:r>
     </w:p>
-    <w:bookmarkEnd w:id="27"/>
-    <w:bookmarkStart w:id="32" w:name="b.-member-1-anees-saheba-guddi-1"/>
+    <w:bookmarkEnd w:id="33"/>
+    <w:bookmarkStart w:id="47" w:name="b.-member-1-anees-saheba-guddi-1"/>
     <w:p>
       <w:pPr>
         <w:pStyle w:val="Heading2"/>
@@ -5382,7 +5501,7 @@
         <w:t xml:space="preserve">B. Member 1: Anees Saheba Guddi</w:t>
       </w:r>
     </w:p>
-    <w:bookmarkStart w:id="28" w:name="models"/>
+    <w:bookmarkStart w:id="34" w:name="models"/>
     <w:p>
       <w:pPr>
         <w:pStyle w:val="Heading3"/>
@@ -5809,8 +5928,8 @@
         <w:t xml:space="preserve">change the baseline prediction, and the measured difference is exactly 0.0.</w:t>
       </w:r>
     </w:p>
-    <w:bookmarkEnd w:id="28"/>
-    <w:bookmarkStart w:id="29" w:name="preprocessing-and-hyperparameters"/>
+    <w:bookmarkEnd w:id="34"/>
+    <w:bookmarkStart w:id="35" w:name="preprocessing-and-hyperparameters"/>
     <w:p>
       <w:pPr>
         <w:pStyle w:val="Heading3"/>
@@ -5956,14 +6075,179 @@
         <w:t xml:space="preserve">positive.</w:t>
       </w:r>
     </w:p>
-    <w:bookmarkEnd w:id="29"/>
-    <w:bookmarkStart w:id="30" w:name="results-2"/>
+    <w:bookmarkEnd w:id="35"/>
+    <w:bookmarkStart w:id="45" w:name="results-2"/>
     <w:p>
       <w:pPr>
         <w:pStyle w:val="Heading3"/>
       </w:pPr>
       <w:r>
         <w:t xml:space="preserve">3) Results</w:t>
+      </w:r>
+    </w:p>
+    <w:p>
+      <w:pPr>
+        <w:pStyle w:val="CaptionedFigure"/>
+      </w:pPr>
+      <w:r>
+        <w:drawing>
+          <wp:inline>
+            <wp:extent cx="5334000" cy="1333500"/>
+            <wp:effectExtent b="0" l="0" r="0" t="0"/>
+            <wp:docPr descr="Fig. 3. Class balance and review length distribution for the Yelp Polarity split used by Anees. Both classes are exactly balanced and the 320 token limit keeps 92.65 percent of reviews whole." title="" id="37" name="Picture"/>
+            <a:graphic>
+              <a:graphicData uri="http://schemas.openxmlformats.org/drawingml/2006/picture">
+                <pic:pic>
+                  <pic:nvPicPr>
+                    <pic:cNvPr descr="figures/fig5_t2_data.png" id="38" name="Picture"/>
+                    <pic:cNvPicPr>
+                      <a:picLocks noChangeArrowheads="1" noChangeAspect="1"/>
+                    </pic:cNvPicPr>
+                  </pic:nvPicPr>
+                  <pic:blipFill>
+                    <a:blip r:embed="rId36"/>
+                    <a:stretch>
+                      <a:fillRect/>
+                    </a:stretch>
+                  </pic:blipFill>
+                  <pic:spPr bwMode="auto">
+                    <a:xfrm>
+                      <a:off x="0" y="0"/>
+                      <a:ext cx="5334000" cy="1333500"/>
+                    </a:xfrm>
+                    <a:prstGeom prst="rect">
+                      <a:avLst/>
+                    </a:prstGeom>
+                    <a:noFill/>
+                    <a:ln w="9525">
+                      <a:noFill/>
+                      <a:headEnd/>
+                      <a:tailEnd/>
+                    </a:ln>
+                  </pic:spPr>
+                </pic:pic>
+              </a:graphicData>
+            </a:graphic>
+          </wp:inline>
+        </w:drawing>
+      </w:r>
+    </w:p>
+    <w:p>
+      <w:pPr>
+        <w:pStyle w:val="ImageCaption"/>
+      </w:pPr>
+      <w:r>
+        <w:t xml:space="preserve">Fig. 3. Class balance and review length distribution for the Yelp Polarity split used by Anees. Both classes are exactly balanced and the 320 token limit keeps 92.65 percent of reviews whole.</w:t>
+      </w:r>
+    </w:p>
+    <w:p>
+      <w:pPr>
+        <w:pStyle w:val="CaptionedFigure"/>
+      </w:pPr>
+      <w:r>
+        <w:drawing>
+          <wp:inline>
+            <wp:extent cx="5334000" cy="1500187"/>
+            <wp:effectExtent b="0" l="0" r="0" t="0"/>
+            <wp:docPr descr="Fig. 4. ROC, precision recall and calibration curves for all three of Anees’s classifiers. Attention pooling sits closest to the diagonal on the calibration panel, which is its expected calibration error of 0.0024." title="" id="40" name="Picture"/>
+            <a:graphic>
+              <a:graphicData uri="http://schemas.openxmlformats.org/drawingml/2006/picture">
+                <pic:pic>
+                  <pic:nvPicPr>
+                    <pic:cNvPr descr="figures/fig3_t2_anees_roc.png" id="41" name="Picture"/>
+                    <pic:cNvPicPr>
+                      <a:picLocks noChangeArrowheads="1" noChangeAspect="1"/>
+                    </pic:cNvPicPr>
+                  </pic:nvPicPr>
+                  <pic:blipFill>
+                    <a:blip r:embed="rId39"/>
+                    <a:stretch>
+                      <a:fillRect/>
+                    </a:stretch>
+                  </pic:blipFill>
+                  <pic:spPr bwMode="auto">
+                    <a:xfrm>
+                      <a:off x="0" y="0"/>
+                      <a:ext cx="5334000" cy="1500187"/>
+                    </a:xfrm>
+                    <a:prstGeom prst="rect">
+                      <a:avLst/>
+                    </a:prstGeom>
+                    <a:noFill/>
+                    <a:ln w="9525">
+                      <a:noFill/>
+                      <a:headEnd/>
+                      <a:tailEnd/>
+                    </a:ln>
+                  </pic:spPr>
+                </pic:pic>
+              </a:graphicData>
+            </a:graphic>
+          </wp:inline>
+        </w:drawing>
+      </w:r>
+    </w:p>
+    <w:p>
+      <w:pPr>
+        <w:pStyle w:val="ImageCaption"/>
+      </w:pPr>
+      <w:r>
+        <w:t xml:space="preserve">Fig. 4. ROC, precision recall and calibration curves for all three of Anees’s classifiers. Attention pooling sits closest to the diagonal on the calibration panel, which is its expected calibration error of 0.0024.</w:t>
+      </w:r>
+    </w:p>
+    <w:p>
+      <w:pPr>
+        <w:pStyle w:val="CaptionedFigure"/>
+      </w:pPr>
+      <w:r>
+        <w:drawing>
+          <wp:inline>
+            <wp:extent cx="5334000" cy="1493519"/>
+            <wp:effectExtent b="0" l="0" r="0" t="0"/>
+            <wp:docPr descr="Fig. 5. Confusion matrices for the three classifiers, Anees. The LSTM reduces both false positives and false negatives relative to the max pooling baseline." title="" id="43" name="Picture"/>
+            <a:graphic>
+              <a:graphicData uri="http://schemas.openxmlformats.org/drawingml/2006/picture">
+                <pic:pic>
+                  <pic:nvPicPr>
+                    <pic:cNvPr descr="figures/fig4_t2_anees_cm.png" id="44" name="Picture"/>
+                    <pic:cNvPicPr>
+                      <a:picLocks noChangeArrowheads="1" noChangeAspect="1"/>
+                    </pic:cNvPicPr>
+                  </pic:nvPicPr>
+                  <pic:blipFill>
+                    <a:blip r:embed="rId42"/>
+                    <a:stretch>
+                      <a:fillRect/>
+                    </a:stretch>
+                  </pic:blipFill>
+                  <pic:spPr bwMode="auto">
+                    <a:xfrm>
+                      <a:off x="0" y="0"/>
+                      <a:ext cx="5334000" cy="1493519"/>
+                    </a:xfrm>
+                    <a:prstGeom prst="rect">
+                      <a:avLst/>
+                    </a:prstGeom>
+                    <a:noFill/>
+                    <a:ln w="9525">
+                      <a:noFill/>
+                      <a:headEnd/>
+                      <a:tailEnd/>
+                    </a:ln>
+                  </pic:spPr>
+                </pic:pic>
+              </a:graphicData>
+            </a:graphic>
+          </wp:inline>
+        </w:drawing>
+      </w:r>
+    </w:p>
+    <w:p>
+      <w:pPr>
+        <w:pStyle w:val="ImageCaption"/>
+      </w:pPr>
+      <w:r>
+        <w:t xml:space="preserve">Fig. 5. Confusion matrices for the three classifiers, Anees. The LSTM reduces both false positives and false negatives relative to the max pooling baseline.</w:t>
       </w:r>
     </w:p>
     <w:tbl>
@@ -7074,8 +7358,8 @@
         </w:tc>
       </w:tr>
     </w:tbl>
-    <w:bookmarkEnd w:id="30"/>
-    <w:bookmarkStart w:id="31" w:name="error-review-twenty-errors"/>
+    <w:bookmarkEnd w:id="45"/>
+    <w:bookmarkStart w:id="46" w:name="error-review-twenty-errors"/>
     <w:p>
       <w:pPr>
         <w:pStyle w:val="Heading3"/>
@@ -7520,9 +7804,9 @@
         <w:t xml:space="preserve">the length limit is the obvious fix and the wrong one.</w:t>
       </w:r>
     </w:p>
-    <w:bookmarkEnd w:id="31"/>
-    <w:bookmarkEnd w:id="32"/>
-    <w:bookmarkStart w:id="37" w:name="c.-member-2-yashashree-shinde-1"/>
+    <w:bookmarkEnd w:id="46"/>
+    <w:bookmarkEnd w:id="47"/>
+    <w:bookmarkStart w:id="52" w:name="c.-member-2-yashashree-shinde-1"/>
     <w:p>
       <w:pPr>
         <w:pStyle w:val="Heading2"/>
@@ -7531,7 +7815,7 @@
         <w:t xml:space="preserve">C. Member 2: Yashashree Shinde</w:t>
       </w:r>
     </w:p>
-    <w:bookmarkStart w:id="33" w:name="models-1"/>
+    <w:bookmarkStart w:id="48" w:name="models-1"/>
     <w:p>
       <w:pPr>
         <w:pStyle w:val="Heading3"/>
@@ -7804,8 +8088,8 @@
         <w:t xml:space="preserve">represent word order and carry negation scope across a span.</w:t>
       </w:r>
     </w:p>
-    <w:bookmarkEnd w:id="33"/>
-    <w:bookmarkStart w:id="34" w:name="preprocessing-and-hyperparameters-1"/>
+    <w:bookmarkEnd w:id="48"/>
+    <w:bookmarkStart w:id="49" w:name="preprocessing-and-hyperparameters-1"/>
     <w:p>
       <w:pPr>
         <w:pStyle w:val="Heading3"/>
@@ -7908,8 +8192,8 @@
         <w:t xml:space="preserve">Validation fraction 0.10, bootstrap samples 1,000.</w:t>
       </w:r>
     </w:p>
-    <w:bookmarkEnd w:id="34"/>
-    <w:bookmarkStart w:id="35" w:name="results-3"/>
+    <w:bookmarkEnd w:id="49"/>
+    <w:bookmarkStart w:id="50" w:name="results-3"/>
     <w:p>
       <w:pPr>
         <w:pStyle w:val="Heading3"/>
@@ -9097,8 +9381,8 @@
         </w:tc>
       </w:tr>
     </w:tbl>
-    <w:bookmarkEnd w:id="35"/>
-    <w:bookmarkStart w:id="36" w:name="error-review-twenty-errors-1"/>
+    <w:bookmarkEnd w:id="50"/>
+    <w:bookmarkStart w:id="51" w:name="error-review-twenty-errors-1"/>
     <w:p>
       <w:pPr>
         <w:pStyle w:val="Heading3"/>
@@ -9573,9 +9857,9 @@
         <w:t xml:space="preserve">sit at exactly her 256 token limit.</w:t>
       </w:r>
     </w:p>
-    <w:bookmarkEnd w:id="36"/>
-    <w:bookmarkEnd w:id="37"/>
-    <w:bookmarkStart w:id="38" w:name="d.-side-by-side-comparison-1"/>
+    <w:bookmarkEnd w:id="51"/>
+    <w:bookmarkEnd w:id="52"/>
+    <w:bookmarkStart w:id="53" w:name="d.-side-by-side-comparison-1"/>
     <w:p>
       <w:pPr>
         <w:pStyle w:val="Heading2"/>
@@ -11130,8 +11414,8 @@
         </w:tc>
       </w:tr>
     </w:tbl>
-    <w:bookmarkEnd w:id="38"/>
-    <w:bookmarkStart w:id="39" w:name="e.-joint-analysis-1"/>
+    <w:bookmarkEnd w:id="53"/>
+    <w:bookmarkStart w:id="54" w:name="e.-joint-analysis-1"/>
     <w:p>
       <w:pPr>
         <w:pStyle w:val="Heading2"/>
@@ -11682,9 +11966,9 @@
         <w:t xml:space="preserve">maximum of p and 1 minus p rather than p of the positive class.</w:t>
       </w:r>
     </w:p>
-    <w:bookmarkEnd w:id="39"/>
-    <w:bookmarkEnd w:id="40"/>
-    <w:bookmarkStart w:id="54" w:name="X5fa90fecd73043b209734526fc2973c35b67be4"/>
+    <w:bookmarkEnd w:id="54"/>
+    <w:bookmarkEnd w:id="55"/>
+    <w:bookmarkStart w:id="87" w:name="X5fa90fecd73043b209734526fc2973c35b67be4"/>
     <w:p>
       <w:pPr>
         <w:pStyle w:val="Heading1"/>
@@ -11693,7 +11977,7 @@
         <w:t xml:space="preserve">III. TASK 3: CYCLEGAN MONET AND PHOTO STYLE TRANSFER</w:t>
       </w:r>
     </w:p>
-    <w:bookmarkStart w:id="41" w:name="a.-objective-2"/>
+    <w:bookmarkStart w:id="56" w:name="a.-objective-2"/>
     <w:p>
       <w:pPr>
         <w:pStyle w:val="Heading2"/>
@@ -11742,8 +12026,8 @@
         <w:t xml:space="preserve">there is no target image to compare an output against.</w:t>
       </w:r>
     </w:p>
-    <w:bookmarkEnd w:id="41"/>
-    <w:bookmarkStart w:id="46" w:name="b.-member-1-anees-saheba-guddi-2"/>
+    <w:bookmarkEnd w:id="56"/>
+    <w:bookmarkStart w:id="64" w:name="b.-member-1-anees-saheba-guddi-2"/>
     <w:p>
       <w:pPr>
         <w:pStyle w:val="Heading2"/>
@@ -11752,7 +12036,7 @@
         <w:t xml:space="preserve">B. Member 1: Anees Saheba Guddi</w:t>
       </w:r>
     </w:p>
-    <w:bookmarkStart w:id="42" w:name="architecture-2"/>
+    <w:bookmarkStart w:id="57" w:name="architecture-2"/>
     <w:p>
       <w:pPr>
         <w:pStyle w:val="Heading3"/>
@@ -12201,8 +12485,8 @@
         <w:t xml:space="preserve">right.</w:t>
       </w:r>
     </w:p>
-    <w:bookmarkEnd w:id="42"/>
-    <w:bookmarkStart w:id="43" w:name="hyperparameters"/>
+    <w:bookmarkEnd w:id="57"/>
+    <w:bookmarkStart w:id="58" w:name="hyperparameters"/>
     <w:p>
       <w:pPr>
         <w:pStyle w:val="Heading3"/>
@@ -12567,14 +12851,69 @@
         <w:t xml:space="preserve">measurement. Lowering it frees the generator to repaint.</w:t>
       </w:r>
     </w:p>
-    <w:bookmarkEnd w:id="43"/>
-    <w:bookmarkStart w:id="44" w:name="results-4"/>
+    <w:bookmarkEnd w:id="58"/>
+    <w:bookmarkStart w:id="62" w:name="results-4"/>
     <w:p>
       <w:pPr>
         <w:pStyle w:val="Heading3"/>
       </w:pPr>
       <w:r>
         <w:t xml:space="preserve">3) Results</w:t>
+      </w:r>
+    </w:p>
+    <w:p>
+      <w:pPr>
+        <w:pStyle w:val="CaptionedFigure"/>
+      </w:pPr>
+      <w:r>
+        <w:drawing>
+          <wp:inline>
+            <wp:extent cx="5334000" cy="5715000"/>
+            <wp:effectExtent b="0" l="0" r="0" t="0"/>
+            <wp:docPr descr="Fig. 6. CycleGAN training curves over 50 epochs, Anees. Generator and discriminator losses, cycle losses, identity losses and gradient norms. No loss spikes and no non finite steps." title="" id="60" name="Picture"/>
+            <a:graphic>
+              <a:graphicData uri="http://schemas.openxmlformats.org/drawingml/2006/picture">
+                <pic:pic>
+                  <pic:nvPicPr>
+                    <pic:cNvPr descr="figures/fig6_t3_anees_curves.png" id="61" name="Picture"/>
+                    <pic:cNvPicPr>
+                      <a:picLocks noChangeArrowheads="1" noChangeAspect="1"/>
+                    </pic:cNvPicPr>
+                  </pic:nvPicPr>
+                  <pic:blipFill>
+                    <a:blip r:embed="rId59"/>
+                    <a:stretch>
+                      <a:fillRect/>
+                    </a:stretch>
+                  </pic:blipFill>
+                  <pic:spPr bwMode="auto">
+                    <a:xfrm>
+                      <a:off x="0" y="0"/>
+                      <a:ext cx="5334000" cy="5715000"/>
+                    </a:xfrm>
+                    <a:prstGeom prst="rect">
+                      <a:avLst/>
+                    </a:prstGeom>
+                    <a:noFill/>
+                    <a:ln w="9525">
+                      <a:noFill/>
+                      <a:headEnd/>
+                      <a:tailEnd/>
+                    </a:ln>
+                  </pic:spPr>
+                </pic:pic>
+              </a:graphicData>
+            </a:graphic>
+          </wp:inline>
+        </w:drawing>
+      </w:r>
+    </w:p>
+    <w:p>
+      <w:pPr>
+        <w:pStyle w:val="ImageCaption"/>
+      </w:pPr>
+      <w:r>
+        <w:t xml:space="preserve">Fig. 6. CycleGAN training curves over 50 epochs, Anees. Generator and discriminator losses, cycle losses, identity losses and gradient norms. No loss spikes and no non finite steps.</w:t>
       </w:r>
     </w:p>
     <w:tbl>
@@ -13685,8 +14024,8 @@
         <w:t xml:space="preserve">FID 115.0328, each on 300 pairs</w:t>
       </w:r>
     </w:p>
-    <w:bookmarkEnd w:id="44"/>
-    <w:bookmarkStart w:id="45" w:name="failure-analysis-2"/>
+    <w:bookmarkEnd w:id="62"/>
+    <w:bookmarkStart w:id="63" w:name="failure-analysis-2"/>
     <w:p>
       <w:pPr>
         <w:pStyle w:val="Heading3"/>
@@ -14161,9 +14500,9 @@
         <w:t xml:space="preserve">KID from the final checkpoint.</w:t>
       </w:r>
     </w:p>
-    <w:bookmarkEnd w:id="45"/>
-    <w:bookmarkEnd w:id="46"/>
-    <w:bookmarkStart w:id="51" w:name="c.-member-2-yashashree-shinde-2"/>
+    <w:bookmarkEnd w:id="63"/>
+    <w:bookmarkEnd w:id="64"/>
+    <w:bookmarkStart w:id="72" w:name="c.-member-2-yashashree-shinde-2"/>
     <w:p>
       <w:pPr>
         <w:pStyle w:val="Heading2"/>
@@ -14172,7 +14511,7 @@
         <w:t xml:space="preserve">C. Member 2: Yashashree Shinde</w:t>
       </w:r>
     </w:p>
-    <w:bookmarkStart w:id="47" w:name="architecture-3"/>
+    <w:bookmarkStart w:id="65" w:name="architecture-3"/>
     <w:p>
       <w:pPr>
         <w:pStyle w:val="Heading3"/>
@@ -14513,8 +14852,8 @@
         <w:t xml:space="preserve">The remaining components match the reference implementation.</w:t>
       </w:r>
     </w:p>
-    <w:bookmarkEnd w:id="47"/>
-    <w:bookmarkStart w:id="48" w:name="hyperparameters-1"/>
+    <w:bookmarkEnd w:id="65"/>
+    <w:bookmarkStart w:id="66" w:name="hyperparameters-1"/>
     <w:p>
       <w:pPr>
         <w:pStyle w:val="Heading3"/>
@@ -14836,14 +15175,69 @@
         <w:t xml:space="preserve">paper adds it for the painting task.</w:t>
       </w:r>
     </w:p>
-    <w:bookmarkEnd w:id="48"/>
-    <w:bookmarkStart w:id="49" w:name="results-5"/>
+    <w:bookmarkEnd w:id="66"/>
+    <w:bookmarkStart w:id="70" w:name="results-5"/>
     <w:p>
       <w:pPr>
         <w:pStyle w:val="Heading3"/>
       </w:pPr>
       <w:r>
         <w:t xml:space="preserve">3) Results</w:t>
+      </w:r>
+    </w:p>
+    <w:p>
+      <w:pPr>
+        <w:pStyle w:val="CaptionedFigure"/>
+      </w:pPr>
+      <w:r>
+        <w:drawing>
+          <wp:inline>
+            <wp:extent cx="5334000" cy="5715000"/>
+            <wp:effectExtent b="0" l="0" r="0" t="0"/>
+            <wp:docPr descr="Fig. 7. CycleGAN training curves over 50 epochs, Yashashree. The same stability pattern, with gradient norms falling from 43 to 17." title="" id="68" name="Picture"/>
+            <a:graphic>
+              <a:graphicData uri="http://schemas.openxmlformats.org/drawingml/2006/picture">
+                <pic:pic>
+                  <pic:nvPicPr>
+                    <pic:cNvPr descr="figures/fig7_t3_yash_curves.png" id="69" name="Picture"/>
+                    <pic:cNvPicPr>
+                      <a:picLocks noChangeArrowheads="1" noChangeAspect="1"/>
+                    </pic:cNvPicPr>
+                  </pic:nvPicPr>
+                  <pic:blipFill>
+                    <a:blip r:embed="rId67"/>
+                    <a:stretch>
+                      <a:fillRect/>
+                    </a:stretch>
+                  </pic:blipFill>
+                  <pic:spPr bwMode="auto">
+                    <a:xfrm>
+                      <a:off x="0" y="0"/>
+                      <a:ext cx="5334000" cy="5715000"/>
+                    </a:xfrm>
+                    <a:prstGeom prst="rect">
+                      <a:avLst/>
+                    </a:prstGeom>
+                    <a:noFill/>
+                    <a:ln w="9525">
+                      <a:noFill/>
+                      <a:headEnd/>
+                      <a:tailEnd/>
+                    </a:ln>
+                  </pic:spPr>
+                </pic:pic>
+              </a:graphicData>
+            </a:graphic>
+          </wp:inline>
+        </w:drawing>
+      </w:r>
+    </w:p>
+    <w:p>
+      <w:pPr>
+        <w:pStyle w:val="ImageCaption"/>
+      </w:pPr>
+      <w:r>
+        <w:t xml:space="preserve">Fig. 7. CycleGAN training curves over 50 epochs, Yashashree. The same stability pattern, with gradient norms falling from 43 to 17.</w:t>
       </w:r>
     </w:p>
     <w:tbl>
@@ -15912,8 +16306,8 @@
         <w:t xml:space="preserve">Submitted FID 108.9811, MiFID 0.4171</w:t>
       </w:r>
     </w:p>
-    <w:bookmarkEnd w:id="49"/>
-    <w:bookmarkStart w:id="50" w:name="failure-analysis-3"/>
+    <w:bookmarkEnd w:id="70"/>
+    <w:bookmarkStart w:id="71" w:name="failure-analysis-3"/>
     <w:p>
       <w:pPr>
         <w:pStyle w:val="Heading3"/>
@@ -16551,9 +16945,9 @@
         <w:t xml:space="preserve">from 7.72 to 3.55, for the same reason given in her teammate’s section.</w:t>
       </w:r>
     </w:p>
-    <w:bookmarkEnd w:id="50"/>
-    <w:bookmarkEnd w:id="51"/>
-    <w:bookmarkStart w:id="52" w:name="d.-side-by-side-comparison-2"/>
+    <w:bookmarkEnd w:id="71"/>
+    <w:bookmarkEnd w:id="72"/>
+    <w:bookmarkStart w:id="73" w:name="d.-side-by-side-comparison-2"/>
     <w:p>
       <w:pPr>
         <w:pStyle w:val="Heading2"/>
@@ -17927,8 +18321,8 @@
         <w:t xml:space="preserve">differently. Only the scorer’s version is comparable across the class.</w:t>
       </w:r>
     </w:p>
-    <w:bookmarkEnd w:id="52"/>
-    <w:bookmarkStart w:id="53" w:name="e.-joint-analysis-2"/>
+    <w:bookmarkEnd w:id="73"/>
+    <w:bookmarkStart w:id="86" w:name="e.-joint-analysis-2"/>
     <w:p>
       <w:pPr>
         <w:pStyle w:val="Heading2"/>
@@ -18029,7 +18423,227 @@
     </w:p>
     <w:p>
       <w:pPr>
-        <w:pStyle w:val="FirstParagraph"/>
+        <w:pStyle w:val="CaptionedFigure"/>
+      </w:pPr>
+      <w:r>
+        <w:drawing>
+          <wp:inline>
+            <wp:extent cx="5334000" cy="2625969"/>
+            <wp:effectExtent b="0" l="0" r="0" t="0"/>
+            <wp:docPr descr="Fig. 8. The same input photograph translated to Monet by each model. Left, Anees at identity weight 2.5, repainted. Right, Yashashree at identity weight 5.0, still reading as a photograph with brush texture applied." title="" id="75" name="Picture"/>
+            <a:graphic>
+              <a:graphicData uri="http://schemas.openxmlformats.org/drawingml/2006/picture">
+                <pic:pic>
+                  <pic:nvPicPr>
+                    <pic:cNvPr descr="figures/fig8_t3_b2a_compare.png" id="76" name="Picture"/>
+                    <pic:cNvPicPr>
+                      <a:picLocks noChangeArrowheads="1" noChangeAspect="1"/>
+                    </pic:cNvPicPr>
+                  </pic:nvPicPr>
+                  <pic:blipFill>
+                    <a:blip r:embed="rId74"/>
+                    <a:stretch>
+                      <a:fillRect/>
+                    </a:stretch>
+                  </pic:blipFill>
+                  <pic:spPr bwMode="auto">
+                    <a:xfrm>
+                      <a:off x="0" y="0"/>
+                      <a:ext cx="5334000" cy="2625969"/>
+                    </a:xfrm>
+                    <a:prstGeom prst="rect">
+                      <a:avLst/>
+                    </a:prstGeom>
+                    <a:noFill/>
+                    <a:ln w="9525">
+                      <a:noFill/>
+                      <a:headEnd/>
+                      <a:tailEnd/>
+                    </a:ln>
+                  </pic:spPr>
+                </pic:pic>
+              </a:graphicData>
+            </a:graphic>
+          </wp:inline>
+        </w:drawing>
+      </w:r>
+    </w:p>
+    <w:p>
+      <w:pPr>
+        <w:pStyle w:val="ImageCaption"/>
+      </w:pPr>
+      <w:r>
+        <w:t xml:space="preserve">Fig. 8. The same input photograph translated to Monet by each model. Left, Anees at identity weight 2.5, repainted. Right, Yashashree at identity weight 5.0, still reading as a photograph with brush texture applied.</w:t>
+      </w:r>
+    </w:p>
+    <w:p>
+      <w:pPr>
+        <w:pStyle w:val="CaptionedFigure"/>
+      </w:pPr>
+      <w:r>
+        <w:drawing>
+          <wp:inline>
+            <wp:extent cx="5334000" cy="2625969"/>
+            <wp:effectExtent b="0" l="0" r="0" t="0"/>
+            <wp:docPr descr="Fig. 9. Cycle reconstruction, Anees. Left, the original Monet. Right, the reconstruction after a round trip through the photo domain. Structure returns, the palette shifts from warm to cool, which is the measured L1 of 0.1647." title="" id="78" name="Picture"/>
+            <a:graphic>
+              <a:graphicData uri="http://schemas.openxmlformats.org/drawingml/2006/picture">
+                <pic:pic>
+                  <pic:nvPicPr>
+                    <pic:cNvPr descr="figures/fig9_t3_cycle_anees.png" id="79" name="Picture"/>
+                    <pic:cNvPicPr>
+                      <a:picLocks noChangeArrowheads="1" noChangeAspect="1"/>
+                    </pic:cNvPicPr>
+                  </pic:nvPicPr>
+                  <pic:blipFill>
+                    <a:blip r:embed="rId77"/>
+                    <a:stretch>
+                      <a:fillRect/>
+                    </a:stretch>
+                  </pic:blipFill>
+                  <pic:spPr bwMode="auto">
+                    <a:xfrm>
+                      <a:off x="0" y="0"/>
+                      <a:ext cx="5334000" cy="2625969"/>
+                    </a:xfrm>
+                    <a:prstGeom prst="rect">
+                      <a:avLst/>
+                    </a:prstGeom>
+                    <a:noFill/>
+                    <a:ln w="9525">
+                      <a:noFill/>
+                      <a:headEnd/>
+                      <a:tailEnd/>
+                    </a:ln>
+                  </pic:spPr>
+                </pic:pic>
+              </a:graphicData>
+            </a:graphic>
+          </wp:inline>
+        </w:drawing>
+      </w:r>
+    </w:p>
+    <w:p>
+      <w:pPr>
+        <w:pStyle w:val="ImageCaption"/>
+      </w:pPr>
+      <w:r>
+        <w:t xml:space="preserve">Fig. 9. Cycle reconstruction, Anees. Left, the original Monet. Right, the reconstruction after a round trip through the photo domain. Structure returns, the palette shifts from warm to cool, which is the measured L1 of 0.1647.</w:t>
+      </w:r>
+    </w:p>
+    <w:p>
+      <w:pPr>
+        <w:pStyle w:val="CaptionedFigure"/>
+      </w:pPr>
+      <w:r>
+        <w:drawing>
+          <wp:inline>
+            <wp:extent cx="5334000" cy="2625969"/>
+            <wp:effectExtent b="0" l="0" r="0" t="0"/>
+            <wp:docPr descr="Fig. 10. Cycle reconstruction, Yashashree. Left, the original Monet. Right, the reconstruction. Both structure and palette return, which is the measured L1 of 0.1411." title="" id="81" name="Picture"/>
+            <a:graphic>
+              <a:graphicData uri="http://schemas.openxmlformats.org/drawingml/2006/picture">
+                <pic:pic>
+                  <pic:nvPicPr>
+                    <pic:cNvPr descr="figures/fig10_t3_cycle_yash.png" id="82" name="Picture"/>
+                    <pic:cNvPicPr>
+                      <a:picLocks noChangeArrowheads="1" noChangeAspect="1"/>
+                    </pic:cNvPicPr>
+                  </pic:nvPicPr>
+                  <pic:blipFill>
+                    <a:blip r:embed="rId80"/>
+                    <a:stretch>
+                      <a:fillRect/>
+                    </a:stretch>
+                  </pic:blipFill>
+                  <pic:spPr bwMode="auto">
+                    <a:xfrm>
+                      <a:off x="0" y="0"/>
+                      <a:ext cx="5334000" cy="2625969"/>
+                    </a:xfrm>
+                    <a:prstGeom prst="rect">
+                      <a:avLst/>
+                    </a:prstGeom>
+                    <a:noFill/>
+                    <a:ln w="9525">
+                      <a:noFill/>
+                      <a:headEnd/>
+                      <a:tailEnd/>
+                    </a:ln>
+                  </pic:spPr>
+                </pic:pic>
+              </a:graphicData>
+            </a:graphic>
+          </wp:inline>
+        </w:drawing>
+      </w:r>
+    </w:p>
+    <w:p>
+      <w:pPr>
+        <w:pStyle w:val="ImageCaption"/>
+      </w:pPr>
+      <w:r>
+        <w:t xml:space="preserve">Fig. 10. Cycle reconstruction, Yashashree. Left, the original Monet. Right, the reconstruction. Both structure and palette return, which is the measured L1 of 0.1411.</w:t>
+      </w:r>
+    </w:p>
+    <w:p>
+      <w:pPr>
+        <w:pStyle w:val="CaptionedFigure"/>
+      </w:pPr>
+      <w:r>
+        <w:drawing>
+          <wp:inline>
+            <wp:extent cx="5334000" cy="2625969"/>
+            <wp:effectExtent b="0" l="0" r="0" t="0"/>
+            <wp:docPr descr="Fig. 11. Artifacts in flat regions. Left, Anees, repeated blob texture and colour banding across the sky. Right, Yashashree, a saturated checkerboard block on the left of the frame. Both come from the transposed convolution kernel and stride mismatch." title="" id="84" name="Picture"/>
+            <a:graphic>
+              <a:graphicData uri="http://schemas.openxmlformats.org/drawingml/2006/picture">
+                <pic:pic>
+                  <pic:nvPicPr>
+                    <pic:cNvPr descr="figures/fig11_t3_artifacts.png" id="85" name="Picture"/>
+                    <pic:cNvPicPr>
+                      <a:picLocks noChangeArrowheads="1" noChangeAspect="1"/>
+                    </pic:cNvPicPr>
+                  </pic:nvPicPr>
+                  <pic:blipFill>
+                    <a:blip r:embed="rId83"/>
+                    <a:stretch>
+                      <a:fillRect/>
+                    </a:stretch>
+                  </pic:blipFill>
+                  <pic:spPr bwMode="auto">
+                    <a:xfrm>
+                      <a:off x="0" y="0"/>
+                      <a:ext cx="5334000" cy="2625969"/>
+                    </a:xfrm>
+                    <a:prstGeom prst="rect">
+                      <a:avLst/>
+                    </a:prstGeom>
+                    <a:noFill/>
+                    <a:ln w="9525">
+                      <a:noFill/>
+                      <a:headEnd/>
+                      <a:tailEnd/>
+                    </a:ln>
+                  </pic:spPr>
+                </pic:pic>
+              </a:graphicData>
+            </a:graphic>
+          </wp:inline>
+        </w:drawing>
+      </w:r>
+    </w:p>
+    <w:p>
+      <w:pPr>
+        <w:pStyle w:val="ImageCaption"/>
+      </w:pPr>
+      <w:r>
+        <w:t xml:space="preserve">Fig. 11. Artifacts in flat regions. Left, Anees, repeated blob texture and colour banding across the sky. Right, Yashashree, a saturated checkerboard block on the left of the frame. Both come from the transposed convolution kernel and stride mismatch.</w:t>
+      </w:r>
+    </w:p>
+    <w:p>
+      <w:pPr>
+        <w:pStyle w:val="BodyText"/>
       </w:pPr>
       <w:r>
         <w:rPr>
@@ -18411,9 +19025,9 @@
         <w:t xml:space="preserve">coverage become reliable.</w:t>
       </w:r>
     </w:p>
-    <w:bookmarkEnd w:id="53"/>
-    <w:bookmarkEnd w:id="54"/>
-    <w:bookmarkStart w:id="55" w:name="iv.-evidence-trail"/>
+    <w:bookmarkEnd w:id="86"/>
+    <w:bookmarkEnd w:id="87"/>
+    <w:bookmarkStart w:id="88" w:name="iv.-evidence-trail"/>
     <w:p>
       <w:pPr>
         <w:pStyle w:val="Heading1"/>
@@ -19017,8 +19631,8 @@
         <w:t xml:space="preserve">that catches it are in the notebook, and the failed log is kept as evidence.</w:t>
       </w:r>
     </w:p>
-    <w:bookmarkEnd w:id="55"/>
-    <w:bookmarkStart w:id="56" w:name="v.-known-gaps"/>
+    <w:bookmarkEnd w:id="88"/>
+    <w:bookmarkStart w:id="89" w:name="v.-known-gaps"/>
     <w:p>
       <w:pPr>
         <w:pStyle w:val="Heading1"/>
@@ -19227,8 +19841,8 @@
         <w:t xml:space="preserve">for a proper attribution, because it did not fit the booked GPU time.</w:t>
       </w:r>
     </w:p>
-    <w:bookmarkEnd w:id="56"/>
-    <w:bookmarkStart w:id="57" w:name="contents"/>
+    <w:bookmarkEnd w:id="89"/>
+    <w:bookmarkStart w:id="90" w:name="contents"/>
     <w:p>
       <w:pPr>
         <w:pStyle w:val="Heading1"/>
@@ -19776,8 +20390,8 @@
         </w:tc>
       </w:tr>
     </w:tbl>
-    <w:bookmarkEnd w:id="57"/>
-    <w:bookmarkStart w:id="58" w:name="references"/>
+    <w:bookmarkEnd w:id="90"/>
+    <w:bookmarkStart w:id="91" w:name="references"/>
     <w:p>
       <w:pPr>
         <w:pStyle w:val="Heading1"/>
@@ -19860,7 +20474,7 @@
         <w:t xml:space="preserve">used in Task 3.</w:t>
       </w:r>
     </w:p>
-    <w:bookmarkEnd w:id="58"/>
+    <w:bookmarkEnd w:id="91"/>
     <w:sectPr>
       <w:footnotePr>
         <w:numRestart w:val="eachSect"/>

</xml_diff>

<commit_message>
Convert the Task 1 loss curve figure to png
The figure was an svg, which pandoc could not embed in the docx without
rsvg-convert, so figure 2 was present in the pdf and missing from the docx.
Rendering it to png once makes all three formats carry the same eleven
figures.
</commit_message>
<xml_diff>
--- a/report/DATA266_Lab1_Report_Team_8.docx
+++ b/report/DATA266_Lab1_Report_Team_8.docx
@@ -2920,22 +2920,13 @@
               <a:graphicData uri="http://schemas.openxmlformats.org/drawingml/2006/picture">
                 <pic:pic>
                   <pic:nvPicPr>
-                    <pic:cNvPr descr="figures/fig2_t1_yash_loss.svg" id="26" name="Picture"/>
+                    <pic:cNvPr descr="figures/fig2_t1_yash_loss.png" id="26" name="Picture"/>
                     <pic:cNvPicPr>
                       <a:picLocks noChangeArrowheads="1" noChangeAspect="1"/>
                     </pic:cNvPicPr>
                   </pic:nvPicPr>
                   <pic:blipFill>
-                    <a:blip>
-                      <a:extLst>
-                        <a:ext uri="{28A0092B-C50C-407E-A947-70E740481C1C}">
-                          <a14:useLocalDpi xmlns:a14="http://schemas.microsoft.com/office/drawing/2010/main" val="0"/>
-                        </a:ext>
-                        <a:ext uri="{96DAC541-7B7A-43D3-8B79-37D633B846F1}">
-                          <asvg:svgBlip xmlns:asvg="http://schemas.microsoft.com/office/drawing/2016/SVG/main" r:embed="rId24"/>
-                        </a:ext>
-                      </a:extLst>
-                    </a:blip>
+                    <a:blip r:embed="rId24"/>
                     <a:stretch>
                       <a:fillRect/>
                     </a:stretch>

</xml_diff>